<commit_message>
Format report figure and table lists
</commit_message>
<xml_diff>
--- a/BaoCao/Tuan_06_Hoan_Thien_Form_Bao_Cao/CNTT_2022603587_TranHuyHoang_BaoCao_HoanThien_Form.docx
+++ b/BaoCao/Tuan_06_Hoan_Thien_Form_Bao_Cao/CNTT_2022603587_TranHuyHoang_BaoCao_HoanThien_Form.docx
@@ -117,13 +117,6 @@
       <w:pPr>
         <w:spacing w:after="120" w:line="312" w:lineRule="auto"/>
         <w:jc w:val="center"/>
-      </w:pPr>
-      <w:r>
-        <w:t>Hà Nội - Năm 2026</w:t>
-      </w:r>
-    </w:p>
-    <w:p>
-      <w:pPr>
         <w:sectPr>
           <w:headerReference w:type="default" r:id="rId8"/>
           <w:pgSz w:w="11906" w:h="16838"/>
@@ -132,25 +125,22 @@
           <w:docGrid w:linePitch="360"/>
         </w:sectPr>
       </w:pPr>
-    </w:p>
-    <w:p>
-      <w:r>
-        <w:lastRenderedPageBreak/>
-        <w:br w:type="page"/>
-      </w:r>
-    </w:p>
+      <w:r>
+        <w:t>Hà Nội - Năm 2026</w:t>
+      </w:r>
+    </w:p>
+    <w:p/>
     <w:p>
       <w:pPr>
         <w:pStyle w:val="Heading1"/>
         <w:spacing w:after="120" w:line="312" w:lineRule="auto"/>
         <w:jc w:val="center"/>
       </w:pPr>
-      <w:bookmarkStart w:id="0" w:name="_Toc230635715"/>
+      <w:bookmarkStart w:id="0" w:name="_Toc230639660"/>
       <w:r>
         <w:rPr>
           <w:rFonts w:ascii="Times New Roman" w:eastAsia="Times New Roman" w:hAnsi="Times New Roman"/>
         </w:rPr>
-        <w:lastRenderedPageBreak/>
         <w:t>LỜI CẢM ƠN</w:t>
       </w:r>
       <w:bookmarkEnd w:id="0"/>
@@ -242,6 +232,7 @@
         <w:rPr>
           <w:rFonts w:asciiTheme="minorHAnsi" w:eastAsiaTheme="minorEastAsia" w:hAnsiTheme="minorHAnsi"/>
           <w:noProof/>
+          <w:color w:val="auto"/>
           <w:kern w:val="2"/>
           <w:sz w:val="24"/>
           <w:szCs w:val="24"/>
@@ -266,7 +257,7 @@
         </w:rPr>
         <w:fldChar w:fldCharType="separate"/>
       </w:r>
-      <w:hyperlink w:anchor="_Toc230635715" w:history="1">
+      <w:hyperlink w:anchor="_Toc230639660" w:history="1">
         <w:r>
           <w:rPr>
             <w:rStyle w:val="Hyperlink"/>
@@ -293,7 +284,7 @@
             <w:noProof/>
             <w:webHidden/>
           </w:rPr>
-          <w:instrText xml:space="preserve"> PAGEREF _Toc230635715 \h </w:instrText>
+          <w:instrText xml:space="preserve"> PAGEREF _Toc230639660 \h </w:instrText>
         </w:r>
         <w:r>
           <w:rPr>
@@ -313,7 +304,7 @@
             <w:noProof/>
             <w:webHidden/>
           </w:rPr>
-          <w:t>3</w:t>
+          <w:t>2</w:t>
         </w:r>
         <w:r>
           <w:rPr>
@@ -333,13 +324,14 @@
         <w:rPr>
           <w:rFonts w:asciiTheme="minorHAnsi" w:eastAsiaTheme="minorEastAsia" w:hAnsiTheme="minorHAnsi"/>
           <w:noProof/>
+          <w:color w:val="auto"/>
           <w:kern w:val="2"/>
           <w:sz w:val="24"/>
           <w:szCs w:val="24"/>
           <w14:ligatures w14:val="standardContextual"/>
         </w:rPr>
       </w:pPr>
-      <w:hyperlink w:anchor="_Toc230635716" w:history="1">
+      <w:hyperlink w:anchor="_Toc230639661" w:history="1">
         <w:r>
           <w:rPr>
             <w:rStyle w:val="Hyperlink"/>
@@ -366,7 +358,7 @@
             <w:noProof/>
             <w:webHidden/>
           </w:rPr>
-          <w:instrText xml:space="preserve"> PAGEREF _Toc230635716 \h </w:instrText>
+          <w:instrText xml:space="preserve"> PAGEREF _Toc230639661 \h </w:instrText>
         </w:r>
         <w:r>
           <w:rPr>
@@ -386,7 +378,7 @@
             <w:noProof/>
             <w:webHidden/>
           </w:rPr>
-          <w:t>7</w:t>
+          <w:t>5</w:t>
         </w:r>
         <w:r>
           <w:rPr>
@@ -406,13 +398,14 @@
         <w:rPr>
           <w:rFonts w:asciiTheme="minorHAnsi" w:eastAsiaTheme="minorEastAsia" w:hAnsiTheme="minorHAnsi"/>
           <w:noProof/>
+          <w:color w:val="auto"/>
           <w:kern w:val="2"/>
           <w:sz w:val="24"/>
           <w:szCs w:val="24"/>
           <w14:ligatures w14:val="standardContextual"/>
         </w:rPr>
       </w:pPr>
-      <w:hyperlink w:anchor="_Toc230635717" w:history="1">
+      <w:hyperlink w:anchor="_Toc230639662" w:history="1">
         <w:r>
           <w:rPr>
             <w:rStyle w:val="Hyperlink"/>
@@ -439,7 +432,7 @@
             <w:noProof/>
             <w:webHidden/>
           </w:rPr>
-          <w:instrText xml:space="preserve"> PAGEREF _Toc230635717 \h </w:instrText>
+          <w:instrText xml:space="preserve"> PAGEREF _Toc230639662 \h </w:instrText>
         </w:r>
         <w:r>
           <w:rPr>
@@ -459,7 +452,7 @@
             <w:noProof/>
             <w:webHidden/>
           </w:rPr>
-          <w:t>8</w:t>
+          <w:t>5</w:t>
         </w:r>
         <w:r>
           <w:rPr>
@@ -479,13 +472,14 @@
         <w:rPr>
           <w:rFonts w:asciiTheme="minorHAnsi" w:eastAsiaTheme="minorEastAsia" w:hAnsiTheme="minorHAnsi"/>
           <w:noProof/>
+          <w:color w:val="auto"/>
           <w:kern w:val="2"/>
           <w:sz w:val="24"/>
           <w:szCs w:val="24"/>
           <w14:ligatures w14:val="standardContextual"/>
         </w:rPr>
       </w:pPr>
-      <w:hyperlink w:anchor="_Toc230635718" w:history="1">
+      <w:hyperlink w:anchor="_Toc230639663" w:history="1">
         <w:r>
           <w:rPr>
             <w:rStyle w:val="Hyperlink"/>
@@ -512,7 +506,7 @@
             <w:noProof/>
             <w:webHidden/>
           </w:rPr>
-          <w:instrText xml:space="preserve"> PAGEREF _Toc230635718 \h </w:instrText>
+          <w:instrText xml:space="preserve"> PAGEREF _Toc230639663 \h </w:instrText>
         </w:r>
         <w:r>
           <w:rPr>
@@ -532,7 +526,7 @@
             <w:noProof/>
             <w:webHidden/>
           </w:rPr>
-          <w:t>9</w:t>
+          <w:t>6</w:t>
         </w:r>
         <w:r>
           <w:rPr>
@@ -552,13 +546,14 @@
         <w:rPr>
           <w:rFonts w:asciiTheme="minorHAnsi" w:eastAsiaTheme="minorEastAsia" w:hAnsiTheme="minorHAnsi"/>
           <w:noProof/>
+          <w:color w:val="auto"/>
           <w:kern w:val="2"/>
           <w:sz w:val="24"/>
           <w:szCs w:val="24"/>
           <w14:ligatures w14:val="standardContextual"/>
         </w:rPr>
       </w:pPr>
-      <w:hyperlink w:anchor="_Toc230635719" w:history="1">
+      <w:hyperlink w:anchor="_Toc230639664" w:history="1">
         <w:r>
           <w:rPr>
             <w:rStyle w:val="Hyperlink"/>
@@ -585,7 +580,7 @@
             <w:noProof/>
             <w:webHidden/>
           </w:rPr>
-          <w:instrText xml:space="preserve"> PAGEREF _Toc230635719 \h </w:instrText>
+          <w:instrText xml:space="preserve"> PAGEREF _Toc230639664 \h </w:instrText>
         </w:r>
         <w:r>
           <w:rPr>
@@ -605,7 +600,7 @@
             <w:noProof/>
             <w:webHidden/>
           </w:rPr>
-          <w:t>10</w:t>
+          <w:t>7</w:t>
         </w:r>
         <w:r>
           <w:rPr>
@@ -625,13 +620,14 @@
         <w:rPr>
           <w:rFonts w:asciiTheme="minorHAnsi" w:eastAsiaTheme="minorEastAsia" w:hAnsiTheme="minorHAnsi"/>
           <w:noProof/>
+          <w:color w:val="auto"/>
           <w:kern w:val="2"/>
           <w:sz w:val="24"/>
           <w:szCs w:val="24"/>
           <w14:ligatures w14:val="standardContextual"/>
         </w:rPr>
       </w:pPr>
-      <w:hyperlink w:anchor="_Toc230635720" w:history="1">
+      <w:hyperlink w:anchor="_Toc230639665" w:history="1">
         <w:r>
           <w:rPr>
             <w:rStyle w:val="Hyperlink"/>
@@ -658,7 +654,7 @@
             <w:noProof/>
             <w:webHidden/>
           </w:rPr>
-          <w:instrText xml:space="preserve"> PAGEREF _Toc230635720 \h </w:instrText>
+          <w:instrText xml:space="preserve"> PAGEREF _Toc230639665 \h </w:instrText>
         </w:r>
         <w:r>
           <w:rPr>
@@ -678,7 +674,7 @@
             <w:noProof/>
             <w:webHidden/>
           </w:rPr>
-          <w:t>10</w:t>
+          <w:t>7</w:t>
         </w:r>
         <w:r>
           <w:rPr>
@@ -698,13 +694,14 @@
         <w:rPr>
           <w:rFonts w:asciiTheme="minorHAnsi" w:eastAsiaTheme="minorEastAsia" w:hAnsiTheme="minorHAnsi"/>
           <w:noProof/>
+          <w:color w:val="auto"/>
           <w:kern w:val="2"/>
           <w:sz w:val="24"/>
           <w:szCs w:val="24"/>
           <w14:ligatures w14:val="standardContextual"/>
         </w:rPr>
       </w:pPr>
-      <w:hyperlink w:anchor="_Toc230635721" w:history="1">
+      <w:hyperlink w:anchor="_Toc230639666" w:history="1">
         <w:r>
           <w:rPr>
             <w:rStyle w:val="Hyperlink"/>
@@ -731,7 +728,7 @@
             <w:noProof/>
             <w:webHidden/>
           </w:rPr>
-          <w:instrText xml:space="preserve"> PAGEREF _Toc230635721 \h </w:instrText>
+          <w:instrText xml:space="preserve"> PAGEREF _Toc230639666 \h </w:instrText>
         </w:r>
         <w:r>
           <w:rPr>
@@ -751,7 +748,7 @@
             <w:noProof/>
             <w:webHidden/>
           </w:rPr>
-          <w:t>10</w:t>
+          <w:t>7</w:t>
         </w:r>
         <w:r>
           <w:rPr>
@@ -771,13 +768,14 @@
         <w:rPr>
           <w:rFonts w:asciiTheme="minorHAnsi" w:eastAsiaTheme="minorEastAsia" w:hAnsiTheme="minorHAnsi"/>
           <w:noProof/>
+          <w:color w:val="auto"/>
           <w:kern w:val="2"/>
           <w:sz w:val="24"/>
           <w:szCs w:val="24"/>
           <w14:ligatures w14:val="standardContextual"/>
         </w:rPr>
       </w:pPr>
-      <w:hyperlink w:anchor="_Toc230635722" w:history="1">
+      <w:hyperlink w:anchor="_Toc230639667" w:history="1">
         <w:r>
           <w:rPr>
             <w:rStyle w:val="Hyperlink"/>
@@ -804,7 +802,7 @@
             <w:noProof/>
             <w:webHidden/>
           </w:rPr>
-          <w:instrText xml:space="preserve"> PAGEREF _Toc230635722 \h </w:instrText>
+          <w:instrText xml:space="preserve"> PAGEREF _Toc230639667 \h </w:instrText>
         </w:r>
         <w:r>
           <w:rPr>
@@ -824,7 +822,7 @@
             <w:noProof/>
             <w:webHidden/>
           </w:rPr>
-          <w:t>10</w:t>
+          <w:t>7</w:t>
         </w:r>
         <w:r>
           <w:rPr>
@@ -844,13 +842,14 @@
         <w:rPr>
           <w:rFonts w:asciiTheme="minorHAnsi" w:eastAsiaTheme="minorEastAsia" w:hAnsiTheme="minorHAnsi"/>
           <w:noProof/>
+          <w:color w:val="auto"/>
           <w:kern w:val="2"/>
           <w:sz w:val="24"/>
           <w:szCs w:val="24"/>
           <w14:ligatures w14:val="standardContextual"/>
         </w:rPr>
       </w:pPr>
-      <w:hyperlink w:anchor="_Toc230635723" w:history="1">
+      <w:hyperlink w:anchor="_Toc230639668" w:history="1">
         <w:r>
           <w:rPr>
             <w:rStyle w:val="Hyperlink"/>
@@ -877,7 +876,7 @@
             <w:noProof/>
             <w:webHidden/>
           </w:rPr>
-          <w:instrText xml:space="preserve"> PAGEREF _Toc230635723 \h </w:instrText>
+          <w:instrText xml:space="preserve"> PAGEREF _Toc230639668 \h </w:instrText>
         </w:r>
         <w:r>
           <w:rPr>
@@ -897,7 +896,7 @@
             <w:noProof/>
             <w:webHidden/>
           </w:rPr>
-          <w:t>11</w:t>
+          <w:t>8</w:t>
         </w:r>
         <w:r>
           <w:rPr>
@@ -917,13 +916,14 @@
         <w:rPr>
           <w:rFonts w:asciiTheme="minorHAnsi" w:eastAsiaTheme="minorEastAsia" w:hAnsiTheme="minorHAnsi"/>
           <w:noProof/>
+          <w:color w:val="auto"/>
           <w:kern w:val="2"/>
           <w:sz w:val="24"/>
           <w:szCs w:val="24"/>
           <w14:ligatures w14:val="standardContextual"/>
         </w:rPr>
       </w:pPr>
-      <w:hyperlink w:anchor="_Toc230635724" w:history="1">
+      <w:hyperlink w:anchor="_Toc230639669" w:history="1">
         <w:r>
           <w:rPr>
             <w:rStyle w:val="Hyperlink"/>
@@ -951,7 +951,7 @@
             <w:noProof/>
             <w:webHidden/>
           </w:rPr>
-          <w:instrText xml:space="preserve"> PAGEREF _Toc230635724 \h </w:instrText>
+          <w:instrText xml:space="preserve"> PAGEREF _Toc230639669 \h </w:instrText>
         </w:r>
         <w:r>
           <w:rPr>
@@ -971,7 +971,7 @@
             <w:noProof/>
             <w:webHidden/>
           </w:rPr>
-          <w:t>12</w:t>
+          <w:t>9</w:t>
         </w:r>
         <w:r>
           <w:rPr>
@@ -991,13 +991,14 @@
         <w:rPr>
           <w:rFonts w:asciiTheme="minorHAnsi" w:eastAsiaTheme="minorEastAsia" w:hAnsiTheme="minorHAnsi"/>
           <w:noProof/>
+          <w:color w:val="auto"/>
           <w:kern w:val="2"/>
           <w:sz w:val="24"/>
           <w:szCs w:val="24"/>
           <w14:ligatures w14:val="standardContextual"/>
         </w:rPr>
       </w:pPr>
-      <w:hyperlink w:anchor="_Toc230635725" w:history="1">
+      <w:hyperlink w:anchor="_Toc230639670" w:history="1">
         <w:r>
           <w:rPr>
             <w:rStyle w:val="Hyperlink"/>
@@ -1025,7 +1026,7 @@
             <w:noProof/>
             <w:webHidden/>
           </w:rPr>
-          <w:instrText xml:space="preserve"> PAGEREF _Toc230635725 \h </w:instrText>
+          <w:instrText xml:space="preserve"> PAGEREF _Toc230639670 \h </w:instrText>
         </w:r>
         <w:r>
           <w:rPr>
@@ -1045,7 +1046,7 @@
             <w:noProof/>
             <w:webHidden/>
           </w:rPr>
-          <w:t>12</w:t>
+          <w:t>9</w:t>
         </w:r>
         <w:r>
           <w:rPr>
@@ -1065,13 +1066,14 @@
         <w:rPr>
           <w:rFonts w:asciiTheme="minorHAnsi" w:eastAsiaTheme="minorEastAsia" w:hAnsiTheme="minorHAnsi"/>
           <w:noProof/>
+          <w:color w:val="auto"/>
           <w:kern w:val="2"/>
           <w:sz w:val="24"/>
           <w:szCs w:val="24"/>
           <w14:ligatures w14:val="standardContextual"/>
         </w:rPr>
       </w:pPr>
-      <w:hyperlink w:anchor="_Toc230635726" w:history="1">
+      <w:hyperlink w:anchor="_Toc230639671" w:history="1">
         <w:r>
           <w:rPr>
             <w:rStyle w:val="Hyperlink"/>
@@ -1099,7 +1101,7 @@
             <w:noProof/>
             <w:webHidden/>
           </w:rPr>
-          <w:instrText xml:space="preserve"> PAGEREF _Toc230635726 \h </w:instrText>
+          <w:instrText xml:space="preserve"> PAGEREF _Toc230639671 \h </w:instrText>
         </w:r>
         <w:r>
           <w:rPr>
@@ -1119,7 +1121,7 @@
             <w:noProof/>
             <w:webHidden/>
           </w:rPr>
-          <w:t>12</w:t>
+          <w:t>9</w:t>
         </w:r>
         <w:r>
           <w:rPr>
@@ -1139,13 +1141,14 @@
         <w:rPr>
           <w:rFonts w:asciiTheme="minorHAnsi" w:eastAsiaTheme="minorEastAsia" w:hAnsiTheme="minorHAnsi"/>
           <w:noProof/>
+          <w:color w:val="auto"/>
           <w:kern w:val="2"/>
           <w:sz w:val="24"/>
           <w:szCs w:val="24"/>
           <w14:ligatures w14:val="standardContextual"/>
         </w:rPr>
       </w:pPr>
-      <w:hyperlink w:anchor="_Toc230635727" w:history="1">
+      <w:hyperlink w:anchor="_Toc230639672" w:history="1">
         <w:r>
           <w:rPr>
             <w:rStyle w:val="Hyperlink"/>
@@ -1173,7 +1176,7 @@
             <w:noProof/>
             <w:webHidden/>
           </w:rPr>
-          <w:instrText xml:space="preserve"> PAGEREF _Toc230635727 \h </w:instrText>
+          <w:instrText xml:space="preserve"> PAGEREF _Toc230639672 \h </w:instrText>
         </w:r>
         <w:r>
           <w:rPr>
@@ -1193,7 +1196,7 @@
             <w:noProof/>
             <w:webHidden/>
           </w:rPr>
-          <w:t>13</w:t>
+          <w:t>10</w:t>
         </w:r>
         <w:r>
           <w:rPr>
@@ -1213,13 +1216,14 @@
         <w:rPr>
           <w:rFonts w:asciiTheme="minorHAnsi" w:eastAsiaTheme="minorEastAsia" w:hAnsiTheme="minorHAnsi"/>
           <w:noProof/>
+          <w:color w:val="auto"/>
           <w:kern w:val="2"/>
           <w:sz w:val="24"/>
           <w:szCs w:val="24"/>
           <w14:ligatures w14:val="standardContextual"/>
         </w:rPr>
       </w:pPr>
-      <w:hyperlink w:anchor="_Toc230635728" w:history="1">
+      <w:hyperlink w:anchor="_Toc230639673" w:history="1">
         <w:r>
           <w:rPr>
             <w:rStyle w:val="Hyperlink"/>
@@ -1247,7 +1251,7 @@
             <w:noProof/>
             <w:webHidden/>
           </w:rPr>
-          <w:instrText xml:space="preserve"> PAGEREF _Toc230635728 \h </w:instrText>
+          <w:instrText xml:space="preserve"> PAGEREF _Toc230639673 \h </w:instrText>
         </w:r>
         <w:r>
           <w:rPr>
@@ -1267,7 +1271,7 @@
             <w:noProof/>
             <w:webHidden/>
           </w:rPr>
-          <w:t>14</w:t>
+          <w:t>11</w:t>
         </w:r>
         <w:r>
           <w:rPr>
@@ -1287,13 +1291,14 @@
         <w:rPr>
           <w:rFonts w:asciiTheme="minorHAnsi" w:eastAsiaTheme="minorEastAsia" w:hAnsiTheme="minorHAnsi"/>
           <w:noProof/>
+          <w:color w:val="auto"/>
           <w:kern w:val="2"/>
           <w:sz w:val="24"/>
           <w:szCs w:val="24"/>
           <w14:ligatures w14:val="standardContextual"/>
         </w:rPr>
       </w:pPr>
-      <w:hyperlink w:anchor="_Toc230635729" w:history="1">
+      <w:hyperlink w:anchor="_Toc230639674" w:history="1">
         <w:r>
           <w:rPr>
             <w:rStyle w:val="Hyperlink"/>
@@ -1321,7 +1326,7 @@
             <w:noProof/>
             <w:webHidden/>
           </w:rPr>
-          <w:instrText xml:space="preserve"> PAGEREF _Toc230635729 \h </w:instrText>
+          <w:instrText xml:space="preserve"> PAGEREF _Toc230639674 \h </w:instrText>
         </w:r>
         <w:r>
           <w:rPr>
@@ -1341,7 +1346,7 @@
             <w:noProof/>
             <w:webHidden/>
           </w:rPr>
-          <w:t>14</w:t>
+          <w:t>11</w:t>
         </w:r>
         <w:r>
           <w:rPr>
@@ -1361,13 +1366,14 @@
         <w:rPr>
           <w:rFonts w:asciiTheme="minorHAnsi" w:eastAsiaTheme="minorEastAsia" w:hAnsiTheme="minorHAnsi"/>
           <w:noProof/>
+          <w:color w:val="auto"/>
           <w:kern w:val="2"/>
           <w:sz w:val="24"/>
           <w:szCs w:val="24"/>
           <w14:ligatures w14:val="standardContextual"/>
         </w:rPr>
       </w:pPr>
-      <w:hyperlink w:anchor="_Toc230635730" w:history="1">
+      <w:hyperlink w:anchor="_Toc230639675" w:history="1">
         <w:r>
           <w:rPr>
             <w:rStyle w:val="Hyperlink"/>
@@ -1395,7 +1401,7 @@
             <w:noProof/>
             <w:webHidden/>
           </w:rPr>
-          <w:instrText xml:space="preserve"> PAGEREF _Toc230635730 \h </w:instrText>
+          <w:instrText xml:space="preserve"> PAGEREF _Toc230639675 \h </w:instrText>
         </w:r>
         <w:r>
           <w:rPr>
@@ -1415,7 +1421,7 @@
             <w:noProof/>
             <w:webHidden/>
           </w:rPr>
-          <w:t>15</w:t>
+          <w:t>12</w:t>
         </w:r>
         <w:r>
           <w:rPr>
@@ -1435,13 +1441,14 @@
         <w:rPr>
           <w:rFonts w:asciiTheme="minorHAnsi" w:eastAsiaTheme="minorEastAsia" w:hAnsiTheme="minorHAnsi"/>
           <w:noProof/>
+          <w:color w:val="auto"/>
           <w:kern w:val="2"/>
           <w:sz w:val="24"/>
           <w:szCs w:val="24"/>
           <w14:ligatures w14:val="standardContextual"/>
         </w:rPr>
       </w:pPr>
-      <w:hyperlink w:anchor="_Toc230635731" w:history="1">
+      <w:hyperlink w:anchor="_Toc230639676" w:history="1">
         <w:r>
           <w:rPr>
             <w:rStyle w:val="Hyperlink"/>
@@ -1469,7 +1476,7 @@
             <w:noProof/>
             <w:webHidden/>
           </w:rPr>
-          <w:instrText xml:space="preserve"> PAGEREF _Toc230635731 \h </w:instrText>
+          <w:instrText xml:space="preserve"> PAGEREF _Toc230639676 \h </w:instrText>
         </w:r>
         <w:r>
           <w:rPr>
@@ -1489,7 +1496,7 @@
             <w:noProof/>
             <w:webHidden/>
           </w:rPr>
-          <w:t>17</w:t>
+          <w:t>14</w:t>
         </w:r>
         <w:r>
           <w:rPr>
@@ -1509,13 +1516,14 @@
         <w:rPr>
           <w:rFonts w:asciiTheme="minorHAnsi" w:eastAsiaTheme="minorEastAsia" w:hAnsiTheme="minorHAnsi"/>
           <w:noProof/>
+          <w:color w:val="auto"/>
           <w:kern w:val="2"/>
           <w:sz w:val="24"/>
           <w:szCs w:val="24"/>
           <w14:ligatures w14:val="standardContextual"/>
         </w:rPr>
       </w:pPr>
-      <w:hyperlink w:anchor="_Toc230635732" w:history="1">
+      <w:hyperlink w:anchor="_Toc230639677" w:history="1">
         <w:r>
           <w:rPr>
             <w:rStyle w:val="Hyperlink"/>
@@ -1543,7 +1551,7 @@
             <w:noProof/>
             <w:webHidden/>
           </w:rPr>
-          <w:instrText xml:space="preserve"> PAGEREF _Toc230635732 \h </w:instrText>
+          <w:instrText xml:space="preserve"> PAGEREF _Toc230639677 \h </w:instrText>
         </w:r>
         <w:r>
           <w:rPr>
@@ -1563,7 +1571,7 @@
             <w:noProof/>
             <w:webHidden/>
           </w:rPr>
-          <w:t>17</w:t>
+          <w:t>14</w:t>
         </w:r>
         <w:r>
           <w:rPr>
@@ -1583,13 +1591,14 @@
         <w:rPr>
           <w:rFonts w:asciiTheme="minorHAnsi" w:eastAsiaTheme="minorEastAsia" w:hAnsiTheme="minorHAnsi"/>
           <w:noProof/>
+          <w:color w:val="auto"/>
           <w:kern w:val="2"/>
           <w:sz w:val="24"/>
           <w:szCs w:val="24"/>
           <w14:ligatures w14:val="standardContextual"/>
         </w:rPr>
       </w:pPr>
-      <w:hyperlink w:anchor="_Toc230635733" w:history="1">
+      <w:hyperlink w:anchor="_Toc230639678" w:history="1">
         <w:r>
           <w:rPr>
             <w:rStyle w:val="Hyperlink"/>
@@ -1617,7 +1626,7 @@
             <w:noProof/>
             <w:webHidden/>
           </w:rPr>
-          <w:instrText xml:space="preserve"> PAGEREF _Toc230635733 \h </w:instrText>
+          <w:instrText xml:space="preserve"> PAGEREF _Toc230639678 \h </w:instrText>
         </w:r>
         <w:r>
           <w:rPr>
@@ -1637,7 +1646,7 @@
             <w:noProof/>
             <w:webHidden/>
           </w:rPr>
-          <w:t>17</w:t>
+          <w:t>14</w:t>
         </w:r>
         <w:r>
           <w:rPr>
@@ -1657,13 +1666,14 @@
         <w:rPr>
           <w:rFonts w:asciiTheme="minorHAnsi" w:eastAsiaTheme="minorEastAsia" w:hAnsiTheme="minorHAnsi"/>
           <w:noProof/>
+          <w:color w:val="auto"/>
           <w:kern w:val="2"/>
           <w:sz w:val="24"/>
           <w:szCs w:val="24"/>
           <w14:ligatures w14:val="standardContextual"/>
         </w:rPr>
       </w:pPr>
-      <w:hyperlink w:anchor="_Toc230635734" w:history="1">
+      <w:hyperlink w:anchor="_Toc230639679" w:history="1">
         <w:r>
           <w:rPr>
             <w:rStyle w:val="Hyperlink"/>
@@ -1691,7 +1701,7 @@
             <w:noProof/>
             <w:webHidden/>
           </w:rPr>
-          <w:instrText xml:space="preserve"> PAGEREF _Toc230635734 \h </w:instrText>
+          <w:instrText xml:space="preserve"> PAGEREF _Toc230639679 \h </w:instrText>
         </w:r>
         <w:r>
           <w:rPr>
@@ -1711,7 +1721,7 @@
             <w:noProof/>
             <w:webHidden/>
           </w:rPr>
-          <w:t>18</w:t>
+          <w:t>15</w:t>
         </w:r>
         <w:r>
           <w:rPr>
@@ -1731,13 +1741,14 @@
         <w:rPr>
           <w:rFonts w:asciiTheme="minorHAnsi" w:eastAsiaTheme="minorEastAsia" w:hAnsiTheme="minorHAnsi"/>
           <w:noProof/>
+          <w:color w:val="auto"/>
           <w:kern w:val="2"/>
           <w:sz w:val="24"/>
           <w:szCs w:val="24"/>
           <w14:ligatures w14:val="standardContextual"/>
         </w:rPr>
       </w:pPr>
-      <w:hyperlink w:anchor="_Toc230635735" w:history="1">
+      <w:hyperlink w:anchor="_Toc230639680" w:history="1">
         <w:r>
           <w:rPr>
             <w:rStyle w:val="Hyperlink"/>
@@ -1765,7 +1776,7 @@
             <w:noProof/>
             <w:webHidden/>
           </w:rPr>
-          <w:instrText xml:space="preserve"> PAGEREF _Toc230635735 \h </w:instrText>
+          <w:instrText xml:space="preserve"> PAGEREF _Toc230639680 \h </w:instrText>
         </w:r>
         <w:r>
           <w:rPr>
@@ -1785,7 +1796,7 @@
             <w:noProof/>
             <w:webHidden/>
           </w:rPr>
-          <w:t>18</w:t>
+          <w:t>15</w:t>
         </w:r>
         <w:r>
           <w:rPr>
@@ -1805,13 +1816,14 @@
         <w:rPr>
           <w:rFonts w:asciiTheme="minorHAnsi" w:eastAsiaTheme="minorEastAsia" w:hAnsiTheme="minorHAnsi"/>
           <w:noProof/>
+          <w:color w:val="auto"/>
           <w:kern w:val="2"/>
           <w:sz w:val="24"/>
           <w:szCs w:val="24"/>
           <w14:ligatures w14:val="standardContextual"/>
         </w:rPr>
       </w:pPr>
-      <w:hyperlink w:anchor="_Toc230635736" w:history="1">
+      <w:hyperlink w:anchor="_Toc230639681" w:history="1">
         <w:r>
           <w:rPr>
             <w:rStyle w:val="Hyperlink"/>
@@ -1839,7 +1851,7 @@
             <w:noProof/>
             <w:webHidden/>
           </w:rPr>
-          <w:instrText xml:space="preserve"> PAGEREF _Toc230635736 \h </w:instrText>
+          <w:instrText xml:space="preserve"> PAGEREF _Toc230639681 \h </w:instrText>
         </w:r>
         <w:r>
           <w:rPr>
@@ -1859,7 +1871,7 @@
             <w:noProof/>
             <w:webHidden/>
           </w:rPr>
-          <w:t>19</w:t>
+          <w:t>16</w:t>
         </w:r>
         <w:r>
           <w:rPr>
@@ -1879,13 +1891,14 @@
         <w:rPr>
           <w:rFonts w:asciiTheme="minorHAnsi" w:eastAsiaTheme="minorEastAsia" w:hAnsiTheme="minorHAnsi"/>
           <w:noProof/>
+          <w:color w:val="auto"/>
           <w:kern w:val="2"/>
           <w:sz w:val="24"/>
           <w:szCs w:val="24"/>
           <w14:ligatures w14:val="standardContextual"/>
         </w:rPr>
       </w:pPr>
-      <w:hyperlink w:anchor="_Toc230635737" w:history="1">
+      <w:hyperlink w:anchor="_Toc230639682" w:history="1">
         <w:r>
           <w:rPr>
             <w:rStyle w:val="Hyperlink"/>
@@ -1913,7 +1926,7 @@
             <w:noProof/>
             <w:webHidden/>
           </w:rPr>
-          <w:instrText xml:space="preserve"> PAGEREF _Toc230635737 \h </w:instrText>
+          <w:instrText xml:space="preserve"> PAGEREF _Toc230639682 \h </w:instrText>
         </w:r>
         <w:r>
           <w:rPr>
@@ -1933,7 +1946,7 @@
             <w:noProof/>
             <w:webHidden/>
           </w:rPr>
-          <w:t>20</w:t>
+          <w:t>17</w:t>
         </w:r>
         <w:r>
           <w:rPr>
@@ -1953,13 +1966,14 @@
         <w:rPr>
           <w:rFonts w:asciiTheme="minorHAnsi" w:eastAsiaTheme="minorEastAsia" w:hAnsiTheme="minorHAnsi"/>
           <w:noProof/>
+          <w:color w:val="auto"/>
           <w:kern w:val="2"/>
           <w:sz w:val="24"/>
           <w:szCs w:val="24"/>
           <w14:ligatures w14:val="standardContextual"/>
         </w:rPr>
       </w:pPr>
-      <w:hyperlink w:anchor="_Toc230635738" w:history="1">
+      <w:hyperlink w:anchor="_Toc230639683" w:history="1">
         <w:r>
           <w:rPr>
             <w:rStyle w:val="Hyperlink"/>
@@ -1987,7 +2001,7 @@
             <w:noProof/>
             <w:webHidden/>
           </w:rPr>
-          <w:instrText xml:space="preserve"> PAGEREF _Toc230635738 \h </w:instrText>
+          <w:instrText xml:space="preserve"> PAGEREF _Toc230639683 \h </w:instrText>
         </w:r>
         <w:r>
           <w:rPr>
@@ -2007,7 +2021,7 @@
             <w:noProof/>
             <w:webHidden/>
           </w:rPr>
-          <w:t>21</w:t>
+          <w:t>18</w:t>
         </w:r>
         <w:r>
           <w:rPr>
@@ -2027,13 +2041,14 @@
         <w:rPr>
           <w:rFonts w:asciiTheme="minorHAnsi" w:eastAsiaTheme="minorEastAsia" w:hAnsiTheme="minorHAnsi"/>
           <w:noProof/>
+          <w:color w:val="auto"/>
           <w:kern w:val="2"/>
           <w:sz w:val="24"/>
           <w:szCs w:val="24"/>
           <w14:ligatures w14:val="standardContextual"/>
         </w:rPr>
       </w:pPr>
-      <w:hyperlink w:anchor="_Toc230635739" w:history="1">
+      <w:hyperlink w:anchor="_Toc230639684" w:history="1">
         <w:r>
           <w:rPr>
             <w:rStyle w:val="Hyperlink"/>
@@ -2061,7 +2076,7 @@
             <w:noProof/>
             <w:webHidden/>
           </w:rPr>
-          <w:instrText xml:space="preserve"> PAGEREF _Toc230635739 \h </w:instrText>
+          <w:instrText xml:space="preserve"> PAGEREF _Toc230639684 \h </w:instrText>
         </w:r>
         <w:r>
           <w:rPr>
@@ -2081,7 +2096,7 @@
             <w:noProof/>
             <w:webHidden/>
           </w:rPr>
-          <w:t>21</w:t>
+          <w:t>18</w:t>
         </w:r>
         <w:r>
           <w:rPr>
@@ -2101,13 +2116,14 @@
         <w:rPr>
           <w:rFonts w:asciiTheme="minorHAnsi" w:eastAsiaTheme="minorEastAsia" w:hAnsiTheme="minorHAnsi"/>
           <w:noProof/>
+          <w:color w:val="auto"/>
           <w:kern w:val="2"/>
           <w:sz w:val="24"/>
           <w:szCs w:val="24"/>
           <w14:ligatures w14:val="standardContextual"/>
         </w:rPr>
       </w:pPr>
-      <w:hyperlink w:anchor="_Toc230635740" w:history="1">
+      <w:hyperlink w:anchor="_Toc230639685" w:history="1">
         <w:r>
           <w:rPr>
             <w:rStyle w:val="Hyperlink"/>
@@ -2135,7 +2151,7 @@
             <w:noProof/>
             <w:webHidden/>
           </w:rPr>
-          <w:instrText xml:space="preserve"> PAGEREF _Toc230635740 \h </w:instrText>
+          <w:instrText xml:space="preserve"> PAGEREF _Toc230639685 \h </w:instrText>
         </w:r>
         <w:r>
           <w:rPr>
@@ -2155,7 +2171,7 @@
             <w:noProof/>
             <w:webHidden/>
           </w:rPr>
-          <w:t>22</w:t>
+          <w:t>19</w:t>
         </w:r>
         <w:r>
           <w:rPr>
@@ -2175,13 +2191,14 @@
         <w:rPr>
           <w:rFonts w:asciiTheme="minorHAnsi" w:eastAsiaTheme="minorEastAsia" w:hAnsiTheme="minorHAnsi"/>
           <w:noProof/>
+          <w:color w:val="auto"/>
           <w:kern w:val="2"/>
           <w:sz w:val="24"/>
           <w:szCs w:val="24"/>
           <w14:ligatures w14:val="standardContextual"/>
         </w:rPr>
       </w:pPr>
-      <w:hyperlink w:anchor="_Toc230635741" w:history="1">
+      <w:hyperlink w:anchor="_Toc230639686" w:history="1">
         <w:r>
           <w:rPr>
             <w:rStyle w:val="Hyperlink"/>
@@ -2209,7 +2226,7 @@
             <w:noProof/>
             <w:webHidden/>
           </w:rPr>
-          <w:instrText xml:space="preserve"> PAGEREF _Toc230635741 \h </w:instrText>
+          <w:instrText xml:space="preserve"> PAGEREF _Toc230639686 \h </w:instrText>
         </w:r>
         <w:r>
           <w:rPr>
@@ -2229,7 +2246,7 @@
             <w:noProof/>
             <w:webHidden/>
           </w:rPr>
-          <w:t>22</w:t>
+          <w:t>19</w:t>
         </w:r>
         <w:r>
           <w:rPr>
@@ -2249,13 +2266,14 @@
         <w:rPr>
           <w:rFonts w:asciiTheme="minorHAnsi" w:eastAsiaTheme="minorEastAsia" w:hAnsiTheme="minorHAnsi"/>
           <w:noProof/>
+          <w:color w:val="auto"/>
           <w:kern w:val="2"/>
           <w:sz w:val="24"/>
           <w:szCs w:val="24"/>
           <w14:ligatures w14:val="standardContextual"/>
         </w:rPr>
       </w:pPr>
-      <w:hyperlink w:anchor="_Toc230635742" w:history="1">
+      <w:hyperlink w:anchor="_Toc230639687" w:history="1">
         <w:r>
           <w:rPr>
             <w:rStyle w:val="Hyperlink"/>
@@ -2283,7 +2301,7 @@
             <w:noProof/>
             <w:webHidden/>
           </w:rPr>
-          <w:instrText xml:space="preserve"> PAGEREF _Toc230635742 \h </w:instrText>
+          <w:instrText xml:space="preserve"> PAGEREF _Toc230639687 \h </w:instrText>
         </w:r>
         <w:r>
           <w:rPr>
@@ -2303,7 +2321,7 @@
             <w:noProof/>
             <w:webHidden/>
           </w:rPr>
-          <w:t>23</w:t>
+          <w:t>20</w:t>
         </w:r>
         <w:r>
           <w:rPr>
@@ -2323,13 +2341,14 @@
         <w:rPr>
           <w:rFonts w:asciiTheme="minorHAnsi" w:eastAsiaTheme="minorEastAsia" w:hAnsiTheme="minorHAnsi"/>
           <w:noProof/>
+          <w:color w:val="auto"/>
           <w:kern w:val="2"/>
           <w:sz w:val="24"/>
           <w:szCs w:val="24"/>
           <w14:ligatures w14:val="standardContextual"/>
         </w:rPr>
       </w:pPr>
-      <w:hyperlink w:anchor="_Toc230635743" w:history="1">
+      <w:hyperlink w:anchor="_Toc230639688" w:history="1">
         <w:r>
           <w:rPr>
             <w:rStyle w:val="Hyperlink"/>
@@ -2357,7 +2376,7 @@
             <w:noProof/>
             <w:webHidden/>
           </w:rPr>
-          <w:instrText xml:space="preserve"> PAGEREF _Toc230635743 \h </w:instrText>
+          <w:instrText xml:space="preserve"> PAGEREF _Toc230639688 \h </w:instrText>
         </w:r>
         <w:r>
           <w:rPr>
@@ -2377,7 +2396,7 @@
             <w:noProof/>
             <w:webHidden/>
           </w:rPr>
-          <w:t>23</w:t>
+          <w:t>20</w:t>
         </w:r>
         <w:r>
           <w:rPr>
@@ -2397,13 +2416,14 @@
         <w:rPr>
           <w:rFonts w:asciiTheme="minorHAnsi" w:eastAsiaTheme="minorEastAsia" w:hAnsiTheme="minorHAnsi"/>
           <w:noProof/>
+          <w:color w:val="auto"/>
           <w:kern w:val="2"/>
           <w:sz w:val="24"/>
           <w:szCs w:val="24"/>
           <w14:ligatures w14:val="standardContextual"/>
         </w:rPr>
       </w:pPr>
-      <w:hyperlink w:anchor="_Toc230635744" w:history="1">
+      <w:hyperlink w:anchor="_Toc230639689" w:history="1">
         <w:r>
           <w:rPr>
             <w:rStyle w:val="Hyperlink"/>
@@ -2431,7 +2451,7 @@
             <w:noProof/>
             <w:webHidden/>
           </w:rPr>
-          <w:instrText xml:space="preserve"> PAGEREF _Toc230635744 \h </w:instrText>
+          <w:instrText xml:space="preserve"> PAGEREF _Toc230639689 \h </w:instrText>
         </w:r>
         <w:r>
           <w:rPr>
@@ -2451,7 +2471,7 @@
             <w:noProof/>
             <w:webHidden/>
           </w:rPr>
-          <w:t>24</w:t>
+          <w:t>21</w:t>
         </w:r>
         <w:r>
           <w:rPr>
@@ -2471,13 +2491,14 @@
         <w:rPr>
           <w:rFonts w:asciiTheme="minorHAnsi" w:eastAsiaTheme="minorEastAsia" w:hAnsiTheme="minorHAnsi"/>
           <w:noProof/>
+          <w:color w:val="auto"/>
           <w:kern w:val="2"/>
           <w:sz w:val="24"/>
           <w:szCs w:val="24"/>
           <w14:ligatures w14:val="standardContextual"/>
         </w:rPr>
       </w:pPr>
-      <w:hyperlink w:anchor="_Toc230635745" w:history="1">
+      <w:hyperlink w:anchor="_Toc230639690" w:history="1">
         <w:r>
           <w:rPr>
             <w:rStyle w:val="Hyperlink"/>
@@ -2505,7 +2526,7 @@
             <w:noProof/>
             <w:webHidden/>
           </w:rPr>
-          <w:instrText xml:space="preserve"> PAGEREF _Toc230635745 \h </w:instrText>
+          <w:instrText xml:space="preserve"> PAGEREF _Toc230639690 \h </w:instrText>
         </w:r>
         <w:r>
           <w:rPr>
@@ -2525,7 +2546,7 @@
             <w:noProof/>
             <w:webHidden/>
           </w:rPr>
-          <w:t>24</w:t>
+          <w:t>21</w:t>
         </w:r>
         <w:r>
           <w:rPr>
@@ -2545,13 +2566,14 @@
         <w:rPr>
           <w:rFonts w:asciiTheme="minorHAnsi" w:eastAsiaTheme="minorEastAsia" w:hAnsiTheme="minorHAnsi"/>
           <w:noProof/>
+          <w:color w:val="auto"/>
           <w:kern w:val="2"/>
           <w:sz w:val="24"/>
           <w:szCs w:val="24"/>
           <w14:ligatures w14:val="standardContextual"/>
         </w:rPr>
       </w:pPr>
-      <w:hyperlink w:anchor="_Toc230635746" w:history="1">
+      <w:hyperlink w:anchor="_Toc230639691" w:history="1">
         <w:r>
           <w:rPr>
             <w:rStyle w:val="Hyperlink"/>
@@ -2578,7 +2600,7 @@
             <w:noProof/>
             <w:webHidden/>
           </w:rPr>
-          <w:instrText xml:space="preserve"> PAGEREF _Toc230635746 \h </w:instrText>
+          <w:instrText xml:space="preserve"> PAGEREF _Toc230639691 \h </w:instrText>
         </w:r>
         <w:r>
           <w:rPr>
@@ -2598,7 +2620,7 @@
             <w:noProof/>
             <w:webHidden/>
           </w:rPr>
-          <w:t>26</w:t>
+          <w:t>23</w:t>
         </w:r>
         <w:r>
           <w:rPr>
@@ -2618,13 +2640,14 @@
         <w:rPr>
           <w:rFonts w:asciiTheme="minorHAnsi" w:eastAsiaTheme="minorEastAsia" w:hAnsiTheme="minorHAnsi"/>
           <w:noProof/>
+          <w:color w:val="auto"/>
           <w:kern w:val="2"/>
           <w:sz w:val="24"/>
           <w:szCs w:val="24"/>
           <w14:ligatures w14:val="standardContextual"/>
         </w:rPr>
       </w:pPr>
-      <w:hyperlink w:anchor="_Toc230635747" w:history="1">
+      <w:hyperlink w:anchor="_Toc230639692" w:history="1">
         <w:r>
           <w:rPr>
             <w:rStyle w:val="Hyperlink"/>
@@ -2651,7 +2674,7 @@
             <w:noProof/>
             <w:webHidden/>
           </w:rPr>
-          <w:instrText xml:space="preserve"> PAGEREF _Toc230635747 \h </w:instrText>
+          <w:instrText xml:space="preserve"> PAGEREF _Toc230639692 \h </w:instrText>
         </w:r>
         <w:r>
           <w:rPr>
@@ -2671,7 +2694,7 @@
             <w:noProof/>
             <w:webHidden/>
           </w:rPr>
-          <w:t>26</w:t>
+          <w:t>23</w:t>
         </w:r>
         <w:r>
           <w:rPr>
@@ -2691,13 +2714,14 @@
         <w:rPr>
           <w:rFonts w:asciiTheme="minorHAnsi" w:eastAsiaTheme="minorEastAsia" w:hAnsiTheme="minorHAnsi"/>
           <w:noProof/>
+          <w:color w:val="auto"/>
           <w:kern w:val="2"/>
           <w:sz w:val="24"/>
           <w:szCs w:val="24"/>
           <w14:ligatures w14:val="standardContextual"/>
         </w:rPr>
       </w:pPr>
-      <w:hyperlink w:anchor="_Toc230635748" w:history="1">
+      <w:hyperlink w:anchor="_Toc230639693" w:history="1">
         <w:r>
           <w:rPr>
             <w:rStyle w:val="Hyperlink"/>
@@ -2724,7 +2748,7 @@
             <w:noProof/>
             <w:webHidden/>
           </w:rPr>
-          <w:instrText xml:space="preserve"> PAGEREF _Toc230635748 \h </w:instrText>
+          <w:instrText xml:space="preserve"> PAGEREF _Toc230639693 \h </w:instrText>
         </w:r>
         <w:r>
           <w:rPr>
@@ -2744,7 +2768,7 @@
             <w:noProof/>
             <w:webHidden/>
           </w:rPr>
-          <w:t>26</w:t>
+          <w:t>23</w:t>
         </w:r>
         <w:r>
           <w:rPr>
@@ -2764,13 +2788,14 @@
         <w:rPr>
           <w:rFonts w:asciiTheme="minorHAnsi" w:eastAsiaTheme="minorEastAsia" w:hAnsiTheme="minorHAnsi"/>
           <w:noProof/>
+          <w:color w:val="auto"/>
           <w:kern w:val="2"/>
           <w:sz w:val="24"/>
           <w:szCs w:val="24"/>
           <w14:ligatures w14:val="standardContextual"/>
         </w:rPr>
       </w:pPr>
-      <w:hyperlink w:anchor="_Toc230635749" w:history="1">
+      <w:hyperlink w:anchor="_Toc230639694" w:history="1">
         <w:r>
           <w:rPr>
             <w:rStyle w:val="Hyperlink"/>
@@ -2797,7 +2822,7 @@
             <w:noProof/>
             <w:webHidden/>
           </w:rPr>
-          <w:instrText xml:space="preserve"> PAGEREF _Toc230635749 \h </w:instrText>
+          <w:instrText xml:space="preserve"> PAGEREF _Toc230639694 \h </w:instrText>
         </w:r>
         <w:r>
           <w:rPr>
@@ -2817,7 +2842,7 @@
             <w:noProof/>
             <w:webHidden/>
           </w:rPr>
-          <w:t>27</w:t>
+          <w:t>24</w:t>
         </w:r>
         <w:r>
           <w:rPr>
@@ -2837,13 +2862,14 @@
         <w:rPr>
           <w:rFonts w:asciiTheme="minorHAnsi" w:eastAsiaTheme="minorEastAsia" w:hAnsiTheme="minorHAnsi"/>
           <w:noProof/>
+          <w:color w:val="auto"/>
           <w:kern w:val="2"/>
           <w:sz w:val="24"/>
           <w:szCs w:val="24"/>
           <w14:ligatures w14:val="standardContextual"/>
         </w:rPr>
       </w:pPr>
-      <w:hyperlink w:anchor="_Toc230635750" w:history="1">
+      <w:hyperlink w:anchor="_Toc230639695" w:history="1">
         <w:r>
           <w:rPr>
             <w:rStyle w:val="Hyperlink"/>
@@ -2870,7 +2896,7 @@
             <w:noProof/>
             <w:webHidden/>
           </w:rPr>
-          <w:instrText xml:space="preserve"> PAGEREF _Toc230635750 \h </w:instrText>
+          <w:instrText xml:space="preserve"> PAGEREF _Toc230639695 \h </w:instrText>
         </w:r>
         <w:r>
           <w:rPr>
@@ -2890,7 +2916,7 @@
             <w:noProof/>
             <w:webHidden/>
           </w:rPr>
-          <w:t>29</w:t>
+          <w:t>26</w:t>
         </w:r>
         <w:r>
           <w:rPr>
@@ -2910,13 +2936,14 @@
         <w:rPr>
           <w:rFonts w:asciiTheme="minorHAnsi" w:eastAsiaTheme="minorEastAsia" w:hAnsiTheme="minorHAnsi"/>
           <w:noProof/>
+          <w:color w:val="auto"/>
           <w:kern w:val="2"/>
           <w:sz w:val="24"/>
           <w:szCs w:val="24"/>
           <w14:ligatures w14:val="standardContextual"/>
         </w:rPr>
       </w:pPr>
-      <w:hyperlink w:anchor="_Toc230635751" w:history="1">
+      <w:hyperlink w:anchor="_Toc230639696" w:history="1">
         <w:r>
           <w:rPr>
             <w:rStyle w:val="Hyperlink"/>
@@ -2943,7 +2970,7 @@
             <w:noProof/>
             <w:webHidden/>
           </w:rPr>
-          <w:instrText xml:space="preserve"> PAGEREF _Toc230635751 \h </w:instrText>
+          <w:instrText xml:space="preserve"> PAGEREF _Toc230639696 \h </w:instrText>
         </w:r>
         <w:r>
           <w:rPr>
@@ -2963,7 +2990,7 @@
             <w:noProof/>
             <w:webHidden/>
           </w:rPr>
-          <w:t>29</w:t>
+          <w:t>26</w:t>
         </w:r>
         <w:r>
           <w:rPr>
@@ -2983,13 +3010,14 @@
         <w:rPr>
           <w:rFonts w:asciiTheme="minorHAnsi" w:eastAsiaTheme="minorEastAsia" w:hAnsiTheme="minorHAnsi"/>
           <w:noProof/>
+          <w:color w:val="auto"/>
           <w:kern w:val="2"/>
           <w:sz w:val="24"/>
           <w:szCs w:val="24"/>
           <w14:ligatures w14:val="standardContextual"/>
         </w:rPr>
       </w:pPr>
-      <w:hyperlink w:anchor="_Toc230635752" w:history="1">
+      <w:hyperlink w:anchor="_Toc230639697" w:history="1">
         <w:r>
           <w:rPr>
             <w:rStyle w:val="Hyperlink"/>
@@ -3016,7 +3044,7 @@
             <w:noProof/>
             <w:webHidden/>
           </w:rPr>
-          <w:instrText xml:space="preserve"> PAGEREF _Toc230635752 \h </w:instrText>
+          <w:instrText xml:space="preserve"> PAGEREF _Toc230639697 \h </w:instrText>
         </w:r>
         <w:r>
           <w:rPr>
@@ -3036,7 +3064,7 @@
             <w:noProof/>
             <w:webHidden/>
           </w:rPr>
-          <w:t>30</w:t>
+          <w:t>27</w:t>
         </w:r>
         <w:r>
           <w:rPr>
@@ -3056,13 +3084,14 @@
         <w:rPr>
           <w:rFonts w:asciiTheme="minorHAnsi" w:eastAsiaTheme="minorEastAsia" w:hAnsiTheme="minorHAnsi"/>
           <w:noProof/>
+          <w:color w:val="auto"/>
           <w:kern w:val="2"/>
           <w:sz w:val="24"/>
           <w:szCs w:val="24"/>
           <w14:ligatures w14:val="standardContextual"/>
         </w:rPr>
       </w:pPr>
-      <w:hyperlink w:anchor="_Toc230635753" w:history="1">
+      <w:hyperlink w:anchor="_Toc230639698" w:history="1">
         <w:r>
           <w:rPr>
             <w:rStyle w:val="Hyperlink"/>
@@ -3089,7 +3118,7 @@
             <w:noProof/>
             <w:webHidden/>
           </w:rPr>
-          <w:instrText xml:space="preserve"> PAGEREF _Toc230635753 \h </w:instrText>
+          <w:instrText xml:space="preserve"> PAGEREF _Toc230639698 \h </w:instrText>
         </w:r>
         <w:r>
           <w:rPr>
@@ -3109,7 +3138,7 @@
             <w:noProof/>
             <w:webHidden/>
           </w:rPr>
-          <w:t>31</w:t>
+          <w:t>28</w:t>
         </w:r>
         <w:r>
           <w:rPr>
@@ -3129,13 +3158,14 @@
         <w:rPr>
           <w:rFonts w:asciiTheme="minorHAnsi" w:eastAsiaTheme="minorEastAsia" w:hAnsiTheme="minorHAnsi"/>
           <w:noProof/>
+          <w:color w:val="auto"/>
           <w:kern w:val="2"/>
           <w:sz w:val="24"/>
           <w:szCs w:val="24"/>
           <w14:ligatures w14:val="standardContextual"/>
         </w:rPr>
       </w:pPr>
-      <w:hyperlink w:anchor="_Toc230635754" w:history="1">
+      <w:hyperlink w:anchor="_Toc230639699" w:history="1">
         <w:r>
           <w:rPr>
             <w:rStyle w:val="Hyperlink"/>
@@ -3162,7 +3192,7 @@
             <w:noProof/>
             <w:webHidden/>
           </w:rPr>
-          <w:instrText xml:space="preserve"> PAGEREF _Toc230635754 \h </w:instrText>
+          <w:instrText xml:space="preserve"> PAGEREF _Toc230639699 \h </w:instrText>
         </w:r>
         <w:r>
           <w:rPr>
@@ -3182,7 +3212,7 @@
             <w:noProof/>
             <w:webHidden/>
           </w:rPr>
-          <w:t>31</w:t>
+          <w:t>28</w:t>
         </w:r>
         <w:r>
           <w:rPr>
@@ -3202,13 +3232,14 @@
         <w:rPr>
           <w:rFonts w:asciiTheme="minorHAnsi" w:eastAsiaTheme="minorEastAsia" w:hAnsiTheme="minorHAnsi"/>
           <w:noProof/>
+          <w:color w:val="auto"/>
           <w:kern w:val="2"/>
           <w:sz w:val="24"/>
           <w:szCs w:val="24"/>
           <w14:ligatures w14:val="standardContextual"/>
         </w:rPr>
       </w:pPr>
-      <w:hyperlink w:anchor="_Toc230635755" w:history="1">
+      <w:hyperlink w:anchor="_Toc230639700" w:history="1">
         <w:r>
           <w:rPr>
             <w:rStyle w:val="Hyperlink"/>
@@ -3235,7 +3266,7 @@
             <w:noProof/>
             <w:webHidden/>
           </w:rPr>
-          <w:instrText xml:space="preserve"> PAGEREF _Toc230635755 \h </w:instrText>
+          <w:instrText xml:space="preserve"> PAGEREF _Toc230639700 \h </w:instrText>
         </w:r>
         <w:r>
           <w:rPr>
@@ -3255,7 +3286,7 @@
             <w:noProof/>
             <w:webHidden/>
           </w:rPr>
-          <w:t>31</w:t>
+          <w:t>28</w:t>
         </w:r>
         <w:r>
           <w:rPr>
@@ -3275,13 +3306,14 @@
         <w:rPr>
           <w:rFonts w:asciiTheme="minorHAnsi" w:eastAsiaTheme="minorEastAsia" w:hAnsiTheme="minorHAnsi"/>
           <w:noProof/>
+          <w:color w:val="auto"/>
           <w:kern w:val="2"/>
           <w:sz w:val="24"/>
           <w:szCs w:val="24"/>
           <w14:ligatures w14:val="standardContextual"/>
         </w:rPr>
       </w:pPr>
-      <w:hyperlink w:anchor="_Toc230635756" w:history="1">
+      <w:hyperlink w:anchor="_Toc230639701" w:history="1">
         <w:r>
           <w:rPr>
             <w:rStyle w:val="Hyperlink"/>
@@ -3308,7 +3340,7 @@
             <w:noProof/>
             <w:webHidden/>
           </w:rPr>
-          <w:instrText xml:space="preserve"> PAGEREF _Toc230635756 \h </w:instrText>
+          <w:instrText xml:space="preserve"> PAGEREF _Toc230639701 \h </w:instrText>
         </w:r>
         <w:r>
           <w:rPr>
@@ -3328,7 +3360,7 @@
             <w:noProof/>
             <w:webHidden/>
           </w:rPr>
-          <w:t>34</w:t>
+          <w:t>31</w:t>
         </w:r>
         <w:r>
           <w:rPr>
@@ -3348,13 +3380,14 @@
         <w:rPr>
           <w:rFonts w:asciiTheme="minorHAnsi" w:eastAsiaTheme="minorEastAsia" w:hAnsiTheme="minorHAnsi"/>
           <w:noProof/>
+          <w:color w:val="auto"/>
           <w:kern w:val="2"/>
           <w:sz w:val="24"/>
           <w:szCs w:val="24"/>
           <w14:ligatures w14:val="standardContextual"/>
         </w:rPr>
       </w:pPr>
-      <w:hyperlink w:anchor="_Toc230635757" w:history="1">
+      <w:hyperlink w:anchor="_Toc230639702" w:history="1">
         <w:r>
           <w:rPr>
             <w:rStyle w:val="Hyperlink"/>
@@ -3381,7 +3414,7 @@
             <w:noProof/>
             <w:webHidden/>
           </w:rPr>
-          <w:instrText xml:space="preserve"> PAGEREF _Toc230635757 \h </w:instrText>
+          <w:instrText xml:space="preserve"> PAGEREF _Toc230639702 \h </w:instrText>
         </w:r>
         <w:r>
           <w:rPr>
@@ -3401,7 +3434,7 @@
             <w:noProof/>
             <w:webHidden/>
           </w:rPr>
-          <w:t>35</w:t>
+          <w:t>32</w:t>
         </w:r>
         <w:r>
           <w:rPr>
@@ -3421,13 +3454,14 @@
         <w:rPr>
           <w:rFonts w:asciiTheme="minorHAnsi" w:eastAsiaTheme="minorEastAsia" w:hAnsiTheme="minorHAnsi"/>
           <w:noProof/>
+          <w:color w:val="auto"/>
           <w:kern w:val="2"/>
           <w:sz w:val="24"/>
           <w:szCs w:val="24"/>
           <w14:ligatures w14:val="standardContextual"/>
         </w:rPr>
       </w:pPr>
-      <w:hyperlink w:anchor="_Toc230635758" w:history="1">
+      <w:hyperlink w:anchor="_Toc230639703" w:history="1">
         <w:r>
           <w:rPr>
             <w:rStyle w:val="Hyperlink"/>
@@ -3454,7 +3488,7 @@
             <w:noProof/>
             <w:webHidden/>
           </w:rPr>
-          <w:instrText xml:space="preserve"> PAGEREF _Toc230635758 \h </w:instrText>
+          <w:instrText xml:space="preserve"> PAGEREF _Toc230639703 \h </w:instrText>
         </w:r>
         <w:r>
           <w:rPr>
@@ -3474,7 +3508,7 @@
             <w:noProof/>
             <w:webHidden/>
           </w:rPr>
-          <w:t>36</w:t>
+          <w:t>33</w:t>
         </w:r>
         <w:r>
           <w:rPr>
@@ -3494,13 +3528,14 @@
         <w:rPr>
           <w:rFonts w:asciiTheme="minorHAnsi" w:eastAsiaTheme="minorEastAsia" w:hAnsiTheme="minorHAnsi"/>
           <w:noProof/>
+          <w:color w:val="auto"/>
           <w:kern w:val="2"/>
           <w:sz w:val="24"/>
           <w:szCs w:val="24"/>
           <w14:ligatures w14:val="standardContextual"/>
         </w:rPr>
       </w:pPr>
-      <w:hyperlink w:anchor="_Toc230635759" w:history="1">
+      <w:hyperlink w:anchor="_Toc230639704" w:history="1">
         <w:r>
           <w:rPr>
             <w:rStyle w:val="Hyperlink"/>
@@ -3527,7 +3562,7 @@
             <w:noProof/>
             <w:webHidden/>
           </w:rPr>
-          <w:instrText xml:space="preserve"> PAGEREF _Toc230635759 \h </w:instrText>
+          <w:instrText xml:space="preserve"> PAGEREF _Toc230639704 \h </w:instrText>
         </w:r>
         <w:r>
           <w:rPr>
@@ -3547,7 +3582,7 @@
             <w:noProof/>
             <w:webHidden/>
           </w:rPr>
-          <w:t>36</w:t>
+          <w:t>33</w:t>
         </w:r>
         <w:r>
           <w:rPr>
@@ -3567,13 +3602,14 @@
         <w:rPr>
           <w:rFonts w:asciiTheme="minorHAnsi" w:eastAsiaTheme="minorEastAsia" w:hAnsiTheme="minorHAnsi"/>
           <w:noProof/>
+          <w:color w:val="auto"/>
           <w:kern w:val="2"/>
           <w:sz w:val="24"/>
           <w:szCs w:val="24"/>
           <w14:ligatures w14:val="standardContextual"/>
         </w:rPr>
       </w:pPr>
-      <w:hyperlink w:anchor="_Toc230635760" w:history="1">
+      <w:hyperlink w:anchor="_Toc230639705" w:history="1">
         <w:r>
           <w:rPr>
             <w:rStyle w:val="Hyperlink"/>
@@ -3600,7 +3636,7 @@
             <w:noProof/>
             <w:webHidden/>
           </w:rPr>
-          <w:instrText xml:space="preserve"> PAGEREF _Toc230635760 \h </w:instrText>
+          <w:instrText xml:space="preserve"> PAGEREF _Toc230639705 \h </w:instrText>
         </w:r>
         <w:r>
           <w:rPr>
@@ -3620,7 +3656,7 @@
             <w:noProof/>
             <w:webHidden/>
           </w:rPr>
-          <w:t>37</w:t>
+          <w:t>34</w:t>
         </w:r>
         <w:r>
           <w:rPr>
@@ -3640,13 +3676,14 @@
         <w:rPr>
           <w:rFonts w:asciiTheme="minorHAnsi" w:eastAsiaTheme="minorEastAsia" w:hAnsiTheme="minorHAnsi"/>
           <w:noProof/>
+          <w:color w:val="auto"/>
           <w:kern w:val="2"/>
           <w:sz w:val="24"/>
           <w:szCs w:val="24"/>
           <w14:ligatures w14:val="standardContextual"/>
         </w:rPr>
       </w:pPr>
-      <w:hyperlink w:anchor="_Toc230635761" w:history="1">
+      <w:hyperlink w:anchor="_Toc230639706" w:history="1">
         <w:r>
           <w:rPr>
             <w:rStyle w:val="Hyperlink"/>
@@ -3673,7 +3710,7 @@
             <w:noProof/>
             <w:webHidden/>
           </w:rPr>
-          <w:instrText xml:space="preserve"> PAGEREF _Toc230635761 \h </w:instrText>
+          <w:instrText xml:space="preserve"> PAGEREF _Toc230639706 \h </w:instrText>
         </w:r>
         <w:r>
           <w:rPr>
@@ -3693,7 +3730,7 @@
             <w:noProof/>
             <w:webHidden/>
           </w:rPr>
-          <w:t>38</w:t>
+          <w:t>35</w:t>
         </w:r>
         <w:r>
           <w:rPr>
@@ -3713,13 +3750,14 @@
         <w:rPr>
           <w:rFonts w:asciiTheme="minorHAnsi" w:eastAsiaTheme="minorEastAsia" w:hAnsiTheme="minorHAnsi"/>
           <w:noProof/>
+          <w:color w:val="auto"/>
           <w:kern w:val="2"/>
           <w:sz w:val="24"/>
           <w:szCs w:val="24"/>
           <w14:ligatures w14:val="standardContextual"/>
         </w:rPr>
       </w:pPr>
-      <w:hyperlink w:anchor="_Toc230635762" w:history="1">
+      <w:hyperlink w:anchor="_Toc230639707" w:history="1">
         <w:r>
           <w:rPr>
             <w:rStyle w:val="Hyperlink"/>
@@ -3746,7 +3784,7 @@
             <w:noProof/>
             <w:webHidden/>
           </w:rPr>
-          <w:instrText xml:space="preserve"> PAGEREF _Toc230635762 \h </w:instrText>
+          <w:instrText xml:space="preserve"> PAGEREF _Toc230639707 \h </w:instrText>
         </w:r>
         <w:r>
           <w:rPr>
@@ -3766,7 +3804,7 @@
             <w:noProof/>
             <w:webHidden/>
           </w:rPr>
-          <w:t>40</w:t>
+          <w:t>37</w:t>
         </w:r>
         <w:r>
           <w:rPr>
@@ -3786,13 +3824,14 @@
         <w:rPr>
           <w:rFonts w:asciiTheme="minorHAnsi" w:eastAsiaTheme="minorEastAsia" w:hAnsiTheme="minorHAnsi"/>
           <w:noProof/>
+          <w:color w:val="auto"/>
           <w:kern w:val="2"/>
           <w:sz w:val="24"/>
           <w:szCs w:val="24"/>
           <w14:ligatures w14:val="standardContextual"/>
         </w:rPr>
       </w:pPr>
-      <w:hyperlink w:anchor="_Toc230635763" w:history="1">
+      <w:hyperlink w:anchor="_Toc230639708" w:history="1">
         <w:r>
           <w:rPr>
             <w:rStyle w:val="Hyperlink"/>
@@ -3819,7 +3858,7 @@
             <w:noProof/>
             <w:webHidden/>
           </w:rPr>
-          <w:instrText xml:space="preserve"> PAGEREF _Toc230635763 \h </w:instrText>
+          <w:instrText xml:space="preserve"> PAGEREF _Toc230639708 \h </w:instrText>
         </w:r>
         <w:r>
           <w:rPr>
@@ -3839,7 +3878,7 @@
             <w:noProof/>
             <w:webHidden/>
           </w:rPr>
-          <w:t>43</w:t>
+          <w:t>40</w:t>
         </w:r>
         <w:r>
           <w:rPr>
@@ -3859,13 +3898,14 @@
         <w:rPr>
           <w:rFonts w:asciiTheme="minorHAnsi" w:eastAsiaTheme="minorEastAsia" w:hAnsiTheme="minorHAnsi"/>
           <w:noProof/>
+          <w:color w:val="auto"/>
           <w:kern w:val="2"/>
           <w:sz w:val="24"/>
           <w:szCs w:val="24"/>
           <w14:ligatures w14:val="standardContextual"/>
         </w:rPr>
       </w:pPr>
-      <w:hyperlink w:anchor="_Toc230635764" w:history="1">
+      <w:hyperlink w:anchor="_Toc230639709" w:history="1">
         <w:r>
           <w:rPr>
             <w:rStyle w:val="Hyperlink"/>
@@ -3892,7 +3932,7 @@
             <w:noProof/>
             <w:webHidden/>
           </w:rPr>
-          <w:instrText xml:space="preserve"> PAGEREF _Toc230635764 \h </w:instrText>
+          <w:instrText xml:space="preserve"> PAGEREF _Toc230639709 \h </w:instrText>
         </w:r>
         <w:r>
           <w:rPr>
@@ -3912,7 +3952,7 @@
             <w:noProof/>
             <w:webHidden/>
           </w:rPr>
-          <w:t>43</w:t>
+          <w:t>40</w:t>
         </w:r>
         <w:r>
           <w:rPr>
@@ -3932,13 +3972,14 @@
         <w:rPr>
           <w:rFonts w:asciiTheme="minorHAnsi" w:eastAsiaTheme="minorEastAsia" w:hAnsiTheme="minorHAnsi"/>
           <w:noProof/>
+          <w:color w:val="auto"/>
           <w:kern w:val="2"/>
           <w:sz w:val="24"/>
           <w:szCs w:val="24"/>
           <w14:ligatures w14:val="standardContextual"/>
         </w:rPr>
       </w:pPr>
-      <w:hyperlink w:anchor="_Toc230635765" w:history="1">
+      <w:hyperlink w:anchor="_Toc230639710" w:history="1">
         <w:r>
           <w:rPr>
             <w:rStyle w:val="Hyperlink"/>
@@ -3965,7 +4006,7 @@
             <w:noProof/>
             <w:webHidden/>
           </w:rPr>
-          <w:instrText xml:space="preserve"> PAGEREF _Toc230635765 \h </w:instrText>
+          <w:instrText xml:space="preserve"> PAGEREF _Toc230639710 \h </w:instrText>
         </w:r>
         <w:r>
           <w:rPr>
@@ -3985,7 +4026,7 @@
             <w:noProof/>
             <w:webHidden/>
           </w:rPr>
-          <w:t>45</w:t>
+          <w:t>42</w:t>
         </w:r>
         <w:r>
           <w:rPr>
@@ -4005,13 +4046,14 @@
         <w:rPr>
           <w:rFonts w:asciiTheme="minorHAnsi" w:eastAsiaTheme="minorEastAsia" w:hAnsiTheme="minorHAnsi"/>
           <w:noProof/>
+          <w:color w:val="auto"/>
           <w:kern w:val="2"/>
           <w:sz w:val="24"/>
           <w:szCs w:val="24"/>
           <w14:ligatures w14:val="standardContextual"/>
         </w:rPr>
       </w:pPr>
-      <w:hyperlink w:anchor="_Toc230635766" w:history="1">
+      <w:hyperlink w:anchor="_Toc230639711" w:history="1">
         <w:r>
           <w:rPr>
             <w:rStyle w:val="Hyperlink"/>
@@ -4038,7 +4080,7 @@
             <w:noProof/>
             <w:webHidden/>
           </w:rPr>
-          <w:instrText xml:space="preserve"> PAGEREF _Toc230635766 \h </w:instrText>
+          <w:instrText xml:space="preserve"> PAGEREF _Toc230639711 \h </w:instrText>
         </w:r>
         <w:r>
           <w:rPr>
@@ -4058,7 +4100,7 @@
             <w:noProof/>
             <w:webHidden/>
           </w:rPr>
-          <w:t>45</w:t>
+          <w:t>42</w:t>
         </w:r>
         <w:r>
           <w:rPr>
@@ -4078,13 +4120,14 @@
         <w:rPr>
           <w:rFonts w:asciiTheme="minorHAnsi" w:eastAsiaTheme="minorEastAsia" w:hAnsiTheme="minorHAnsi"/>
           <w:noProof/>
+          <w:color w:val="auto"/>
           <w:kern w:val="2"/>
           <w:sz w:val="24"/>
           <w:szCs w:val="24"/>
           <w14:ligatures w14:val="standardContextual"/>
         </w:rPr>
       </w:pPr>
-      <w:hyperlink w:anchor="_Toc230635767" w:history="1">
+      <w:hyperlink w:anchor="_Toc230639712" w:history="1">
         <w:r>
           <w:rPr>
             <w:rStyle w:val="Hyperlink"/>
@@ -4111,7 +4154,7 @@
             <w:noProof/>
             <w:webHidden/>
           </w:rPr>
-          <w:instrText xml:space="preserve"> PAGEREF _Toc230635767 \h </w:instrText>
+          <w:instrText xml:space="preserve"> PAGEREF _Toc230639712 \h </w:instrText>
         </w:r>
         <w:r>
           <w:rPr>
@@ -4131,7 +4174,7 @@
             <w:noProof/>
             <w:webHidden/>
           </w:rPr>
-          <w:t>46</w:t>
+          <w:t>43</w:t>
         </w:r>
         <w:r>
           <w:rPr>
@@ -4151,13 +4194,14 @@
         <w:rPr>
           <w:rFonts w:asciiTheme="minorHAnsi" w:eastAsiaTheme="minorEastAsia" w:hAnsiTheme="minorHAnsi"/>
           <w:noProof/>
+          <w:color w:val="auto"/>
           <w:kern w:val="2"/>
           <w:sz w:val="24"/>
           <w:szCs w:val="24"/>
           <w14:ligatures w14:val="standardContextual"/>
         </w:rPr>
       </w:pPr>
-      <w:hyperlink w:anchor="_Toc230635768" w:history="1">
+      <w:hyperlink w:anchor="_Toc230639713" w:history="1">
         <w:r>
           <w:rPr>
             <w:rStyle w:val="Hyperlink"/>
@@ -4184,7 +4228,7 @@
             <w:noProof/>
             <w:webHidden/>
           </w:rPr>
-          <w:instrText xml:space="preserve"> PAGEREF _Toc230635768 \h </w:instrText>
+          <w:instrText xml:space="preserve"> PAGEREF _Toc230639713 \h </w:instrText>
         </w:r>
         <w:r>
           <w:rPr>
@@ -4204,7 +4248,7 @@
             <w:noProof/>
             <w:webHidden/>
           </w:rPr>
-          <w:t>46</w:t>
+          <w:t>43</w:t>
         </w:r>
         <w:r>
           <w:rPr>
@@ -4224,13 +4268,14 @@
         <w:rPr>
           <w:rFonts w:asciiTheme="minorHAnsi" w:eastAsiaTheme="minorEastAsia" w:hAnsiTheme="minorHAnsi"/>
           <w:noProof/>
+          <w:color w:val="auto"/>
           <w:kern w:val="2"/>
           <w:sz w:val="24"/>
           <w:szCs w:val="24"/>
           <w14:ligatures w14:val="standardContextual"/>
         </w:rPr>
       </w:pPr>
-      <w:hyperlink w:anchor="_Toc230635769" w:history="1">
+      <w:hyperlink w:anchor="_Toc230639714" w:history="1">
         <w:r>
           <w:rPr>
             <w:rStyle w:val="Hyperlink"/>
@@ -4257,7 +4302,7 @@
             <w:noProof/>
             <w:webHidden/>
           </w:rPr>
-          <w:instrText xml:space="preserve"> PAGEREF _Toc230635769 \h </w:instrText>
+          <w:instrText xml:space="preserve"> PAGEREF _Toc230639714 \h </w:instrText>
         </w:r>
         <w:r>
           <w:rPr>
@@ -4277,7 +4322,7 @@
             <w:noProof/>
             <w:webHidden/>
           </w:rPr>
-          <w:t>48</w:t>
+          <w:t>45</w:t>
         </w:r>
         <w:r>
           <w:rPr>
@@ -4297,13 +4342,14 @@
         <w:rPr>
           <w:rFonts w:asciiTheme="minorHAnsi" w:eastAsiaTheme="minorEastAsia" w:hAnsiTheme="minorHAnsi"/>
           <w:noProof/>
+          <w:color w:val="auto"/>
           <w:kern w:val="2"/>
           <w:sz w:val="24"/>
           <w:szCs w:val="24"/>
           <w14:ligatures w14:val="standardContextual"/>
         </w:rPr>
       </w:pPr>
-      <w:hyperlink w:anchor="_Toc230635770" w:history="1">
+      <w:hyperlink w:anchor="_Toc230639715" w:history="1">
         <w:r>
           <w:rPr>
             <w:rStyle w:val="Hyperlink"/>
@@ -4330,7 +4376,7 @@
             <w:noProof/>
             <w:webHidden/>
           </w:rPr>
-          <w:instrText xml:space="preserve"> PAGEREF _Toc230635770 \h </w:instrText>
+          <w:instrText xml:space="preserve"> PAGEREF _Toc230639715 \h </w:instrText>
         </w:r>
         <w:r>
           <w:rPr>
@@ -4350,7 +4396,7 @@
             <w:noProof/>
             <w:webHidden/>
           </w:rPr>
-          <w:t>49</w:t>
+          <w:t>46</w:t>
         </w:r>
         <w:r>
           <w:rPr>
@@ -4374,402 +4420,1003 @@
         <w:br w:type="page"/>
       </w:r>
     </w:p>
-    <w:p>
-      <w:r>
-        <w:lastRenderedPageBreak/>
-        <w:br w:type="page"/>
-      </w:r>
-    </w:p>
+    <w:p/>
     <w:p>
       <w:pPr>
         <w:pStyle w:val="Heading1"/>
-        <w:spacing w:after="120" w:line="312" w:lineRule="auto"/>
+        <w:spacing w:after="240" w:line="312" w:lineRule="auto"/>
         <w:jc w:val="center"/>
       </w:pPr>
-      <w:bookmarkStart w:id="1" w:name="_Toc230635716"/>
+      <w:bookmarkStart w:id="1" w:name="_Toc230639661"/>
       <w:r>
         <w:rPr>
           <w:rFonts w:ascii="Times New Roman" w:eastAsia="Times New Roman" w:hAnsi="Times New Roman"/>
+          <w:sz w:val="32"/>
         </w:rPr>
-        <w:lastRenderedPageBreak/>
         <w:t>DANH MỤC BẢNG BIỂU</w:t>
       </w:r>
       <w:bookmarkEnd w:id="1"/>
     </w:p>
     <w:p>
       <w:pPr>
+        <w:tabs>
+          <w:tab w:val="right" w:leader="dot" w:pos="9071"/>
+        </w:tabs>
         <w:spacing w:after="120" w:line="312" w:lineRule="auto"/>
+      </w:pPr>
+      <w:hyperlink w:anchor="dm_bang_1" w:history="1">
+        <w:r>
+          <w:t>Bảng 1.1. Một số thuận lợi và khó khăn khi ứng dụng thương mại điện tử trong lĩnh vực bán máy tính</w:t>
+        </w:r>
+      </w:hyperlink>
+      <w:r>
+        <w:tab/>
+      </w:r>
+      <w:r>
+        <w:fldChar w:fldCharType="begin"/>
+      </w:r>
+      <w:r>
+        <w:instrText xml:space="preserve"> PAGEREF dm_bang_1 \h </w:instrText>
+      </w:r>
+      <w:r>
+        <w:fldChar w:fldCharType="separate"/>
+      </w:r>
+      <w:r>
+        <w:rPr>
+          <w:noProof/>
+        </w:rPr>
+        <w:t>13</w:t>
+      </w:r>
+      <w:r>
+        <w:fldChar w:fldCharType="end"/>
+      </w:r>
+    </w:p>
+    <w:p>
+      <w:pPr>
+        <w:tabs>
+          <w:tab w:val="right" w:leader="dot" w:pos="9071"/>
+        </w:tabs>
+        <w:spacing w:after="120" w:line="312" w:lineRule="auto"/>
+      </w:pPr>
+      <w:hyperlink w:anchor="dm_bang_2" w:history="1">
+        <w:r>
+          <w:t>Bảng 1.2. Nhóm yêu cầu chính của hệ thống website bán máy tính GTech</w:t>
+        </w:r>
+      </w:hyperlink>
+      <w:r>
+        <w:tab/>
+      </w:r>
+      <w:r>
+        <w:fldChar w:fldCharType="begin"/>
+      </w:r>
+      <w:r>
+        <w:instrText xml:space="preserve"> PAGEREF dm_bang_2 \h </w:instrText>
+      </w:r>
+      <w:r>
+        <w:fldChar w:fldCharType="separate"/>
+      </w:r>
+      <w:r>
+        <w:rPr>
+          <w:noProof/>
+        </w:rPr>
+        <w:t>17</w:t>
+      </w:r>
+      <w:r>
+        <w:fldChar w:fldCharType="end"/>
+      </w:r>
+    </w:p>
+    <w:p>
+      <w:pPr>
+        <w:tabs>
+          <w:tab w:val="right" w:leader="dot" w:pos="9071"/>
+        </w:tabs>
+        <w:spacing w:after="120" w:line="312" w:lineRule="auto"/>
+      </w:pPr>
+      <w:hyperlink w:anchor="dm_bang_3" w:history="1">
+        <w:r>
+          <w:t>Bảng 2.1. Khảo sát sơ bộ hệ thống</w:t>
+        </w:r>
+      </w:hyperlink>
+      <w:r>
+        <w:tab/>
+      </w:r>
+      <w:r>
+        <w:fldChar w:fldCharType="begin"/>
+      </w:r>
+      <w:r>
+        <w:instrText xml:space="preserve"> PAGEREF dm_bang_3 \h </w:instrText>
+      </w:r>
+      <w:r>
+        <w:fldChar w:fldCharType="separate"/>
+      </w:r>
+      <w:r>
+        <w:rPr>
+          <w:noProof/>
+        </w:rPr>
+        <w:t>24</w:t>
+      </w:r>
+      <w:r>
+        <w:fldChar w:fldCharType="end"/>
+      </w:r>
+    </w:p>
+    <w:p>
+      <w:pPr>
+        <w:tabs>
+          <w:tab w:val="right" w:leader="dot" w:pos="9071"/>
+        </w:tabs>
+        <w:spacing w:after="120" w:line="312" w:lineRule="auto"/>
+      </w:pPr>
+      <w:hyperlink w:anchor="dm_bang_4" w:history="1">
+        <w:r>
+          <w:t>Bảng 2.2. Bảng hỏi khảo sát yêu cầu chức năng</w:t>
+        </w:r>
+      </w:hyperlink>
+      <w:r>
+        <w:tab/>
+      </w:r>
+      <w:r>
+        <w:fldChar w:fldCharType="begin"/>
+      </w:r>
+      <w:r>
+        <w:instrText xml:space="preserve"> PAGEREF dm_bang_4 \h </w:instrText>
+      </w:r>
+      <w:r>
+        <w:fldChar w:fldCharType="separate"/>
+      </w:r>
+      <w:r>
+        <w:rPr>
+          <w:noProof/>
+        </w:rPr>
+        <w:t>25</w:t>
+      </w:r>
+      <w:r>
+        <w:fldChar w:fldCharType="end"/>
+      </w:r>
+    </w:p>
+    <w:p>
+      <w:pPr>
+        <w:tabs>
+          <w:tab w:val="right" w:leader="dot" w:pos="9071"/>
+        </w:tabs>
+        <w:spacing w:after="120" w:line="312" w:lineRule="auto"/>
+      </w:pPr>
+      <w:hyperlink w:anchor="dm_bang_5" w:history="1">
+        <w:r>
+          <w:t>Bảng 2.3. Bảng hỏi khảo sát yêu cầu phi chức năng</w:t>
+        </w:r>
+      </w:hyperlink>
+      <w:r>
+        <w:tab/>
+      </w:r>
+      <w:r>
+        <w:fldChar w:fldCharType="begin"/>
+      </w:r>
+      <w:r>
+        <w:instrText xml:space="preserve"> PAGEREF dm_bang_5 \h </w:instrText>
+      </w:r>
+      <w:r>
+        <w:fldChar w:fldCharType="separate"/>
+      </w:r>
+      <w:r>
+        <w:rPr>
+          <w:noProof/>
+        </w:rPr>
+        <w:t>26</w:t>
+      </w:r>
+      <w:r>
+        <w:fldChar w:fldCharType="end"/>
+      </w:r>
+    </w:p>
+    <w:p>
+      <w:pPr>
+        <w:tabs>
+          <w:tab w:val="right" w:leader="dot" w:pos="9071"/>
+        </w:tabs>
+        <w:spacing w:after="120" w:line="312" w:lineRule="auto"/>
+      </w:pPr>
+      <w:hyperlink w:anchor="dm_bang_6" w:history="1">
+        <w:r>
+          <w:t>Bảng 2.4. Danh sách tác nhân của hệ thống</w:t>
+        </w:r>
+      </w:hyperlink>
+      <w:r>
+        <w:tab/>
+      </w:r>
+      <w:r>
+        <w:fldChar w:fldCharType="begin"/>
+      </w:r>
+      <w:r>
+        <w:instrText xml:space="preserve"> PAGEREF dm_bang_6 \h </w:instrText>
+      </w:r>
+      <w:r>
+        <w:fldChar w:fldCharType="separate"/>
+      </w:r>
+      <w:r>
+        <w:rPr>
+          <w:noProof/>
+        </w:rPr>
+        <w:t>27</w:t>
+      </w:r>
+      <w:r>
+        <w:fldChar w:fldCharType="end"/>
+      </w:r>
+    </w:p>
+    <w:p>
+      <w:pPr>
+        <w:tabs>
+          <w:tab w:val="right" w:leader="dot" w:pos="9071"/>
+        </w:tabs>
+        <w:spacing w:after="120" w:line="312" w:lineRule="auto"/>
+      </w:pPr>
+      <w:hyperlink w:anchor="dm_bang_7" w:history="1">
+        <w:r>
+          <w:t>Bảng 2.5. Mô tả use case tìm kiếm và lọc sản phẩm</w:t>
+        </w:r>
+      </w:hyperlink>
+      <w:r>
+        <w:tab/>
+      </w:r>
+      <w:r>
+        <w:fldChar w:fldCharType="begin"/>
+      </w:r>
+      <w:r>
+        <w:instrText xml:space="preserve"> PAGEREF dm_bang_7 \h </w:instrText>
+      </w:r>
+      <w:r>
+        <w:fldChar w:fldCharType="separate"/>
+      </w:r>
+      <w:r>
+        <w:rPr>
+          <w:noProof/>
+        </w:rPr>
+        <w:t>31</w:t>
+      </w:r>
+      <w:r>
+        <w:fldChar w:fldCharType="end"/>
+      </w:r>
+    </w:p>
+    <w:p>
+      <w:pPr>
+        <w:tabs>
+          <w:tab w:val="right" w:leader="dot" w:pos="9071"/>
+        </w:tabs>
+        <w:spacing w:after="120" w:line="312" w:lineRule="auto"/>
+      </w:pPr>
+      <w:hyperlink w:anchor="dm_bang_8" w:history="1">
+        <w:r>
+          <w:t>Bảng 2.6. Mô tả use case tư vấn sản phẩm bằng AI</w:t>
+        </w:r>
+      </w:hyperlink>
+      <w:r>
+        <w:tab/>
+      </w:r>
+      <w:r>
+        <w:fldChar w:fldCharType="begin"/>
+      </w:r>
+      <w:r>
+        <w:instrText xml:space="preserve"> PAGEREF dm_bang_8 \h </w:instrText>
+      </w:r>
+      <w:r>
+        <w:fldChar w:fldCharType="separate"/>
+      </w:r>
+      <w:r>
+        <w:rPr>
+          <w:noProof/>
+        </w:rPr>
+        <w:t>32</w:t>
+      </w:r>
+      <w:r>
+        <w:fldChar w:fldCharType="end"/>
+      </w:r>
+    </w:p>
+    <w:p>
+      <w:pPr>
+        <w:tabs>
+          <w:tab w:val="right" w:leader="dot" w:pos="9071"/>
+        </w:tabs>
+        <w:spacing w:after="120" w:line="312" w:lineRule="auto"/>
+      </w:pPr>
+      <w:hyperlink w:anchor="dm_bang_9" w:history="1">
+        <w:r>
+          <w:t>Bảng 2.7. Mô tả use case đặt hàng</w:t>
+        </w:r>
+      </w:hyperlink>
+      <w:r>
+        <w:tab/>
+      </w:r>
+      <w:r>
+        <w:fldChar w:fldCharType="begin"/>
+      </w:r>
+      <w:r>
+        <w:instrText xml:space="preserve"> PAGEREF dm_bang_9 \h </w:instrText>
+      </w:r>
+      <w:r>
+        <w:fldChar w:fldCharType="separate"/>
+      </w:r>
+      <w:r>
+        <w:rPr>
+          <w:noProof/>
+        </w:rPr>
+        <w:t>32</w:t>
+      </w:r>
+      <w:r>
+        <w:fldChar w:fldCharType="end"/>
+      </w:r>
+    </w:p>
+    <w:p>
+      <w:pPr>
+        <w:tabs>
+          <w:tab w:val="right" w:leader="dot" w:pos="9071"/>
+        </w:tabs>
+        <w:spacing w:after="120" w:line="312" w:lineRule="auto"/>
+      </w:pPr>
+      <w:hyperlink w:anchor="dm_bang_10" w:history="1">
+        <w:r>
+          <w:t>Bảng 2.8. Mô tả các bảng dữ liệu chính</w:t>
+        </w:r>
+      </w:hyperlink>
+      <w:r>
+        <w:tab/>
+      </w:r>
+      <w:r>
+        <w:fldChar w:fldCharType="begin"/>
+      </w:r>
+      <w:r>
+        <w:instrText xml:space="preserve"> PAGEREF dm_bang_10 \h </w:instrText>
+      </w:r>
+      <w:r>
+        <w:fldChar w:fldCharType="separate"/>
+      </w:r>
+      <w:r>
+        <w:rPr>
+          <w:noProof/>
+        </w:rPr>
+        <w:t>34</w:t>
+      </w:r>
+      <w:r>
+        <w:fldChar w:fldCharType="end"/>
+      </w:r>
+    </w:p>
+    <w:p>
+      <w:pPr>
+        <w:tabs>
+          <w:tab w:val="right" w:leader="dot" w:pos="9071"/>
+        </w:tabs>
+        <w:spacing w:after="120" w:line="312" w:lineRule="auto"/>
+      </w:pPr>
+      <w:hyperlink w:anchor="dm_bang_11" w:history="1">
+        <w:r>
+          <w:t>Bảng 2.9. Danh sách màn hình giao diện dự kiến</w:t>
+        </w:r>
+      </w:hyperlink>
+      <w:r>
+        <w:tab/>
+      </w:r>
+      <w:r>
+        <w:fldChar w:fldCharType="begin"/>
+      </w:r>
+      <w:r>
+        <w:instrText xml:space="preserve"> PAGEREF dm_bang_11 \h </w:instrText>
+      </w:r>
+      <w:r>
+        <w:fldChar w:fldCharType="separate"/>
+      </w:r>
+      <w:r>
+        <w:rPr>
+          <w:noProof/>
+        </w:rPr>
+        <w:t>35</w:t>
+      </w:r>
+      <w:r>
+        <w:fldChar w:fldCharType="end"/>
+      </w:r>
+    </w:p>
+    <w:p>
+      <w:pPr>
+        <w:tabs>
+          <w:tab w:val="right" w:leader="dot" w:pos="9071"/>
+        </w:tabs>
+        <w:spacing w:after="120" w:line="312" w:lineRule="auto"/>
+      </w:pPr>
+      <w:hyperlink w:anchor="dm_bang_12" w:history="1">
+        <w:r>
+          <w:t>Bảng 3.1. Công cụ và môi trường cài đặt</w:t>
+        </w:r>
+      </w:hyperlink>
+      <w:r>
+        <w:tab/>
+      </w:r>
+      <w:r>
+        <w:fldChar w:fldCharType="begin"/>
+      </w:r>
+      <w:r>
+        <w:instrText xml:space="preserve"> PAGEREF dm_bang_12 \h </w:instrText>
+      </w:r>
+      <w:r>
+        <w:fldChar w:fldCharType="separate"/>
+      </w:r>
+      <w:r>
+        <w:rPr>
+          <w:noProof/>
+        </w:rPr>
+        <w:t>41</w:t>
+      </w:r>
+      <w:r>
+        <w:fldChar w:fldCharType="end"/>
+      </w:r>
+    </w:p>
+    <w:p>
+      <w:pPr>
+        <w:tabs>
+          <w:tab w:val="right" w:leader="dot" w:pos="9071"/>
+        </w:tabs>
+        <w:spacing w:after="120" w:line="312" w:lineRule="auto"/>
+      </w:pPr>
+      <w:hyperlink w:anchor="dm_bang_13" w:history="1">
+        <w:r>
+          <w:t>Bảng 3.2. Chức năng giao diện khách hàng</w:t>
+        </w:r>
+      </w:hyperlink>
+      <w:r>
+        <w:tab/>
+      </w:r>
+      <w:r>
+        <w:fldChar w:fldCharType="begin"/>
+      </w:r>
+      <w:r>
+        <w:instrText xml:space="preserve"> PAGEREF dm_bang_13 \h </w:instrText>
+      </w:r>
+      <w:r>
+        <w:fldChar w:fldCharType="separate"/>
+      </w:r>
+      <w:r>
+        <w:rPr>
+          <w:noProof/>
+        </w:rPr>
+        <w:t>42</w:t>
+      </w:r>
+      <w:r>
+        <w:fldChar w:fldCharType="end"/>
+      </w:r>
+    </w:p>
+    <w:p>
+      <w:pPr>
+        <w:tabs>
+          <w:tab w:val="right" w:leader="dot" w:pos="9071"/>
+        </w:tabs>
+        <w:spacing w:after="120" w:line="312" w:lineRule="auto"/>
+      </w:pPr>
+      <w:hyperlink w:anchor="dm_bang_14" w:history="1">
+        <w:r>
+          <w:t>Bảng 3.3. Chức năng giao diện quản trị</w:t>
+        </w:r>
+      </w:hyperlink>
+      <w:r>
+        <w:tab/>
+      </w:r>
+      <w:r>
+        <w:fldChar w:fldCharType="begin"/>
+      </w:r>
+      <w:r>
+        <w:instrText xml:space="preserve"> PAGEREF dm_bang_14 \h </w:instrText>
+      </w:r>
+      <w:r>
+        <w:fldChar w:fldCharType="separate"/>
+      </w:r>
+      <w:r>
+        <w:rPr>
+          <w:noProof/>
+        </w:rPr>
+        <w:t>43</w:t>
+      </w:r>
+      <w:r>
+        <w:fldChar w:fldCharType="end"/>
+      </w:r>
+    </w:p>
+    <w:p>
+      <w:pPr>
+        <w:tabs>
+          <w:tab w:val="right" w:leader="dot" w:pos="9071"/>
+        </w:tabs>
+        <w:spacing w:after="120" w:line="312" w:lineRule="auto"/>
+      </w:pPr>
+      <w:hyperlink w:anchor="dm_bang_15" w:history="1">
+        <w:r>
+          <w:t>Bảng 3.4. Kế hoạch kiểm thử chức năng chính</w:t>
+        </w:r>
+      </w:hyperlink>
+      <w:r>
+        <w:tab/>
+      </w:r>
+      <w:r>
+        <w:fldChar w:fldCharType="begin"/>
+      </w:r>
+      <w:r>
+        <w:instrText xml:space="preserve"> PAGEREF dm_bang_15 \h </w:instrText>
+      </w:r>
+      <w:r>
+        <w:fldChar w:fldCharType="separate"/>
+      </w:r>
+      <w:r>
+        <w:rPr>
+          <w:noProof/>
+        </w:rPr>
+        <w:t>43</w:t>
+      </w:r>
+      <w:r>
+        <w:fldChar w:fldCharType="end"/>
+      </w:r>
+    </w:p>
+    <w:p>
+      <w:pPr>
+        <w:pStyle w:val="Heading1"/>
+        <w:spacing w:after="240" w:line="312" w:lineRule="auto"/>
         <w:jc w:val="center"/>
       </w:pPr>
-      <w:r>
-        <w:rPr>
-          <w:i/>
-        </w:rPr>
-        <w:t>Bảng 1.1. Một số thuận lợi và khó khăn khi ứng dụng thương mại điện tử trong lĩnh vực bán máy tính</w:t>
-      </w:r>
-    </w:p>
-    <w:p>
-      <w:pPr>
-        <w:spacing w:after="120" w:line="312" w:lineRule="auto"/>
-        <w:jc w:val="center"/>
-      </w:pPr>
-      <w:r>
-        <w:rPr>
-          <w:i/>
-        </w:rPr>
-        <w:t>Bảng 1.2. Nhóm yêu cầu chính của hệ thống website bán máy tính GTech</w:t>
-      </w:r>
-    </w:p>
-    <w:p>
-      <w:pPr>
-        <w:spacing w:after="120" w:line="312" w:lineRule="auto"/>
-        <w:jc w:val="center"/>
-      </w:pPr>
-      <w:r>
-        <w:rPr>
-          <w:i/>
-        </w:rPr>
-        <w:t>Bảng 2.1. Khảo sát sơ bộ hệ thống</w:t>
-      </w:r>
-    </w:p>
-    <w:p>
-      <w:pPr>
-        <w:spacing w:after="120" w:line="312" w:lineRule="auto"/>
-        <w:jc w:val="center"/>
-      </w:pPr>
-      <w:r>
-        <w:rPr>
-          <w:i/>
-        </w:rPr>
-        <w:t>Bảng 2.2. Bảng hỏi khảo sát yêu cầu chức năng</w:t>
-      </w:r>
-    </w:p>
-    <w:p>
-      <w:pPr>
-        <w:spacing w:after="120" w:line="312" w:lineRule="auto"/>
-        <w:jc w:val="center"/>
-      </w:pPr>
-      <w:r>
-        <w:rPr>
-          <w:i/>
-        </w:rPr>
-        <w:t>Bảng 2.3. Bảng hỏi khảo sát yêu cầu phi chức năng</w:t>
-      </w:r>
-    </w:p>
-    <w:p>
-      <w:pPr>
-        <w:spacing w:after="120" w:line="312" w:lineRule="auto"/>
-        <w:jc w:val="center"/>
-      </w:pPr>
-      <w:r>
-        <w:rPr>
-          <w:i/>
-        </w:rPr>
-        <w:t>Bảng 2.4. Danh sách tác nhân của hệ thống</w:t>
-      </w:r>
-    </w:p>
-    <w:p>
-      <w:pPr>
-        <w:spacing w:after="120" w:line="312" w:lineRule="auto"/>
-        <w:jc w:val="center"/>
-      </w:pPr>
-      <w:r>
-        <w:rPr>
-          <w:i/>
-        </w:rPr>
-        <w:t>Bảng 2.5. Mô tả use case tìm kiếm và lọc sản phẩm</w:t>
-      </w:r>
-    </w:p>
-    <w:p>
-      <w:pPr>
-        <w:spacing w:after="120" w:line="312" w:lineRule="auto"/>
-        <w:jc w:val="center"/>
-      </w:pPr>
-      <w:r>
-        <w:rPr>
-          <w:i/>
-        </w:rPr>
-        <w:t>Bảng 2.6. Mô tả use case tư vấn sản phẩm bằng AI</w:t>
-      </w:r>
-    </w:p>
-    <w:p>
-      <w:pPr>
-        <w:spacing w:after="120" w:line="312" w:lineRule="auto"/>
-        <w:jc w:val="center"/>
-      </w:pPr>
-      <w:r>
-        <w:rPr>
-          <w:i/>
-        </w:rPr>
-        <w:t>Bảng 2.7. Mô tả use case đặt hàng</w:t>
-      </w:r>
-    </w:p>
-    <w:p>
-      <w:pPr>
-        <w:spacing w:after="120" w:line="312" w:lineRule="auto"/>
-        <w:jc w:val="center"/>
-      </w:pPr>
-      <w:r>
-        <w:rPr>
-          <w:i/>
-        </w:rPr>
-        <w:t>Bảng 2.8. Mô tả các bảng dữ liệu chính</w:t>
-      </w:r>
-    </w:p>
-    <w:p>
-      <w:pPr>
-        <w:spacing w:after="120" w:line="312" w:lineRule="auto"/>
-        <w:jc w:val="center"/>
-      </w:pPr>
-      <w:r>
-        <w:rPr>
-          <w:i/>
-        </w:rPr>
-        <w:t>Bảng 2.9. Danh sách màn hình giao diện dự kiến</w:t>
-      </w:r>
-    </w:p>
-    <w:p>
-      <w:pPr>
-        <w:spacing w:after="120" w:line="312" w:lineRule="auto"/>
-        <w:jc w:val="center"/>
-      </w:pPr>
-      <w:r>
-        <w:rPr>
-          <w:i/>
-        </w:rPr>
-        <w:t>Bảng 3.1. Công cụ và môi trường cài đặt</w:t>
-      </w:r>
-    </w:p>
-    <w:p>
-      <w:pPr>
-        <w:spacing w:after="120" w:line="312" w:lineRule="auto"/>
-        <w:jc w:val="center"/>
-      </w:pPr>
-      <w:r>
-        <w:rPr>
-          <w:i/>
-        </w:rPr>
-        <w:t>Bảng 3.2. Chức năng giao diện khách hàng</w:t>
-      </w:r>
-    </w:p>
-    <w:p>
-      <w:pPr>
-        <w:spacing w:after="120" w:line="312" w:lineRule="auto"/>
-        <w:jc w:val="center"/>
-      </w:pPr>
-      <w:r>
-        <w:rPr>
-          <w:i/>
-        </w:rPr>
-        <w:t>Bảng 3.3. Chức năng giao diện quản trị</w:t>
-      </w:r>
-    </w:p>
-    <w:p>
-      <w:pPr>
-        <w:spacing w:after="120" w:line="312" w:lineRule="auto"/>
-        <w:jc w:val="center"/>
-      </w:pPr>
-      <w:r>
-        <w:rPr>
-          <w:i/>
-        </w:rPr>
-        <w:t>Bảng 3.4. Kế hoạch kiểm thử chức năng chính</w:t>
-      </w:r>
-    </w:p>
-    <w:p>
-      <w:r>
-        <w:br w:type="page"/>
-      </w:r>
-    </w:p>
-    <w:p>
-      <w:pPr>
-        <w:pStyle w:val="Heading1"/>
-        <w:spacing w:after="120" w:line="312" w:lineRule="auto"/>
-        <w:jc w:val="center"/>
-      </w:pPr>
-      <w:bookmarkStart w:id="2" w:name="_Toc230635717"/>
+      <w:bookmarkStart w:id="2" w:name="_Toc230639662"/>
       <w:r>
         <w:rPr>
           <w:rFonts w:ascii="Times New Roman" w:eastAsia="Times New Roman" w:hAnsi="Times New Roman"/>
+          <w:sz w:val="32"/>
         </w:rPr>
-        <w:lastRenderedPageBreak/>
         <w:t>DANH MỤC HÌNH ẢNH</w:t>
       </w:r>
       <w:bookmarkEnd w:id="2"/>
     </w:p>
     <w:p>
       <w:pPr>
+        <w:tabs>
+          <w:tab w:val="right" w:leader="dot" w:pos="9071"/>
+        </w:tabs>
         <w:spacing w:after="120" w:line="312" w:lineRule="auto"/>
+      </w:pPr>
+      <w:hyperlink w:anchor="dm_hinh_1" w:history="1">
+        <w:r>
+          <w:t>Hình 2.1. Biểu đồ use case tổng quát của hệ thống website bán máy tính GTech</w:t>
+        </w:r>
+      </w:hyperlink>
+      <w:r>
+        <w:tab/>
+      </w:r>
+      <w:r>
+        <w:fldChar w:fldCharType="begin"/>
+      </w:r>
+      <w:r>
+        <w:instrText xml:space="preserve"> PAGEREF dm_hinh_1 \h </w:instrText>
+      </w:r>
+      <w:r>
+        <w:fldChar w:fldCharType="separate"/>
+      </w:r>
+      <w:r>
+        <w:rPr>
+          <w:noProof/>
+        </w:rPr>
+        <w:t>29</w:t>
+      </w:r>
+      <w:r>
+        <w:fldChar w:fldCharType="end"/>
+      </w:r>
+    </w:p>
+    <w:p>
+      <w:pPr>
+        <w:tabs>
+          <w:tab w:val="right" w:leader="dot" w:pos="9071"/>
+        </w:tabs>
+        <w:spacing w:after="120" w:line="312" w:lineRule="auto"/>
+      </w:pPr>
+      <w:hyperlink w:anchor="dm_hinh_2" w:history="1">
+        <w:r>
+          <w:t>Hình 2.2. Biểu đồ use case nhóm chức năng AI hỗ trợ mua bán hàng</w:t>
+        </w:r>
+      </w:hyperlink>
+      <w:r>
+        <w:tab/>
+      </w:r>
+      <w:r>
+        <w:fldChar w:fldCharType="begin"/>
+      </w:r>
+      <w:r>
+        <w:instrText xml:space="preserve"> PAGEREF dm_hinh_2 \h </w:instrText>
+      </w:r>
+      <w:r>
+        <w:fldChar w:fldCharType="separate"/>
+      </w:r>
+      <w:r>
+        <w:rPr>
+          <w:noProof/>
+        </w:rPr>
+        <w:t>30</w:t>
+      </w:r>
+      <w:r>
+        <w:fldChar w:fldCharType="end"/>
+      </w:r>
+    </w:p>
+    <w:p>
+      <w:pPr>
+        <w:tabs>
+          <w:tab w:val="right" w:leader="dot" w:pos="9071"/>
+        </w:tabs>
+        <w:spacing w:after="120" w:line="312" w:lineRule="auto"/>
+      </w:pPr>
+      <w:hyperlink w:anchor="dm_hinh_3" w:history="1">
+        <w:r>
+          <w:t>Hình 2.3. Biểu đồ lớp tổng quát của hệ thống</w:t>
+        </w:r>
+      </w:hyperlink>
+      <w:r>
+        <w:tab/>
+      </w:r>
+      <w:r>
+        <w:fldChar w:fldCharType="begin"/>
+      </w:r>
+      <w:r>
+        <w:instrText xml:space="preserve"> PAGEREF dm_hinh_3 \h </w:instrText>
+      </w:r>
+      <w:r>
+        <w:fldChar w:fldCharType="separate"/>
+      </w:r>
+      <w:r>
+        <w:rPr>
+          <w:noProof/>
+        </w:rPr>
+        <w:t>33</w:t>
+      </w:r>
+      <w:r>
+        <w:fldChar w:fldCharType="end"/>
+      </w:r>
+    </w:p>
+    <w:p>
+      <w:pPr>
+        <w:tabs>
+          <w:tab w:val="right" w:leader="dot" w:pos="9071"/>
+        </w:tabs>
+        <w:spacing w:after="120" w:line="312" w:lineRule="auto"/>
+      </w:pPr>
+      <w:hyperlink w:anchor="dm_hinh_4" w:history="1">
+        <w:r>
+          <w:t>Hình 2.4. Sơ đồ dữ liệu quan hệ của hệ thống</w:t>
+        </w:r>
+      </w:hyperlink>
+      <w:r>
+        <w:tab/>
+      </w:r>
+      <w:r>
+        <w:fldChar w:fldCharType="begin"/>
+      </w:r>
+      <w:r>
+        <w:instrText xml:space="preserve"> PAGEREF dm_hinh_4 \h </w:instrText>
+      </w:r>
+      <w:r>
+        <w:fldChar w:fldCharType="separate"/>
+      </w:r>
+      <w:r>
+        <w:rPr>
+          <w:noProof/>
+        </w:rPr>
+        <w:t>34</w:t>
+      </w:r>
+      <w:r>
+        <w:fldChar w:fldCharType="end"/>
+      </w:r>
+    </w:p>
+    <w:p>
+      <w:pPr>
+        <w:tabs>
+          <w:tab w:val="right" w:leader="dot" w:pos="9071"/>
+        </w:tabs>
+        <w:spacing w:after="120" w:line="312" w:lineRule="auto"/>
+      </w:pPr>
+      <w:hyperlink w:anchor="dm_hinh_5" w:history="1">
+        <w:r>
+          <w:t>Hình 2.5. Phác thảo màn hình trang chủ</w:t>
+        </w:r>
+      </w:hyperlink>
+      <w:r>
+        <w:tab/>
+      </w:r>
+      <w:r>
+        <w:fldChar w:fldCharType="begin"/>
+      </w:r>
+      <w:r>
+        <w:instrText xml:space="preserve"> PAGEREF dm_hinh_5 \h </w:instrText>
+      </w:r>
+      <w:r>
+        <w:fldChar w:fldCharType="separate"/>
+      </w:r>
+      <w:r>
+        <w:rPr>
+          <w:noProof/>
+        </w:rPr>
+        <w:t>37</w:t>
+      </w:r>
+      <w:r>
+        <w:fldChar w:fldCharType="end"/>
+      </w:r>
+    </w:p>
+    <w:p>
+      <w:pPr>
+        <w:tabs>
+          <w:tab w:val="right" w:leader="dot" w:pos="9071"/>
+        </w:tabs>
+        <w:spacing w:after="120" w:line="312" w:lineRule="auto"/>
+      </w:pPr>
+      <w:hyperlink w:anchor="dm_hinh_6" w:history="1">
+        <w:r>
+          <w:t>Hình 2.6. Phác thảo màn hình danh sách sản phẩm</w:t>
+        </w:r>
+      </w:hyperlink>
+      <w:r>
+        <w:tab/>
+      </w:r>
+      <w:r>
+        <w:fldChar w:fldCharType="begin"/>
+      </w:r>
+      <w:r>
+        <w:instrText xml:space="preserve"> PAGEREF dm_hinh_6 \h </w:instrText>
+      </w:r>
+      <w:r>
+        <w:fldChar w:fldCharType="separate"/>
+      </w:r>
+      <w:r>
+        <w:rPr>
+          <w:noProof/>
+        </w:rPr>
+        <w:t>37</w:t>
+      </w:r>
+      <w:r>
+        <w:fldChar w:fldCharType="end"/>
+      </w:r>
+    </w:p>
+    <w:p>
+      <w:pPr>
+        <w:tabs>
+          <w:tab w:val="right" w:leader="dot" w:pos="9071"/>
+        </w:tabs>
+        <w:spacing w:after="120" w:line="312" w:lineRule="auto"/>
+      </w:pPr>
+      <w:hyperlink w:anchor="dm_hinh_7" w:history="1">
+        <w:r>
+          <w:t>Hình 2.7. Phác thảo màn hình chi tiết sản phẩm</w:t>
+        </w:r>
+      </w:hyperlink>
+      <w:r>
+        <w:tab/>
+      </w:r>
+      <w:r>
+        <w:fldChar w:fldCharType="begin"/>
+      </w:r>
+      <w:r>
+        <w:instrText xml:space="preserve"> PAGEREF dm_hinh_7 \h </w:instrText>
+      </w:r>
+      <w:r>
+        <w:fldChar w:fldCharType="separate"/>
+      </w:r>
+      <w:r>
+        <w:rPr>
+          <w:noProof/>
+        </w:rPr>
+        <w:t>38</w:t>
+      </w:r>
+      <w:r>
+        <w:fldChar w:fldCharType="end"/>
+      </w:r>
+    </w:p>
+    <w:p>
+      <w:pPr>
+        <w:tabs>
+          <w:tab w:val="right" w:leader="dot" w:pos="9071"/>
+        </w:tabs>
+        <w:spacing w:after="120" w:line="312" w:lineRule="auto"/>
+      </w:pPr>
+      <w:hyperlink w:anchor="dm_hinh_8" w:history="1">
+        <w:r>
+          <w:t>Hình 2.8. Phác thảo màn hình giỏ hàng và checkout</w:t>
+        </w:r>
+      </w:hyperlink>
+      <w:r>
+        <w:tab/>
+      </w:r>
+      <w:r>
+        <w:fldChar w:fldCharType="begin"/>
+      </w:r>
+      <w:r>
+        <w:instrText xml:space="preserve"> PAGEREF dm_hinh_8 \h </w:instrText>
+      </w:r>
+      <w:r>
+        <w:fldChar w:fldCharType="separate"/>
+      </w:r>
+      <w:r>
+        <w:rPr>
+          <w:noProof/>
+        </w:rPr>
+        <w:t>38</w:t>
+      </w:r>
+      <w:r>
+        <w:fldChar w:fldCharType="end"/>
+      </w:r>
+    </w:p>
+    <w:p>
+      <w:pPr>
+        <w:tabs>
+          <w:tab w:val="right" w:leader="dot" w:pos="9071"/>
+        </w:tabs>
+        <w:spacing w:after="120" w:line="312" w:lineRule="auto"/>
+      </w:pPr>
+      <w:hyperlink w:anchor="dm_hinh_9" w:history="1">
+        <w:r>
+          <w:t>Hình 2.9. Phác thảo màn hình trợ lý AI GTech</w:t>
+        </w:r>
+      </w:hyperlink>
+      <w:r>
+        <w:tab/>
+      </w:r>
+      <w:r>
+        <w:fldChar w:fldCharType="begin"/>
+      </w:r>
+      <w:r>
+        <w:instrText xml:space="preserve"> PAGEREF dm_hinh_9 \h </w:instrText>
+      </w:r>
+      <w:r>
+        <w:fldChar w:fldCharType="separate"/>
+      </w:r>
+      <w:r>
+        <w:rPr>
+          <w:noProof/>
+        </w:rPr>
+        <w:t>39</w:t>
+      </w:r>
+      <w:r>
+        <w:fldChar w:fldCharType="end"/>
+      </w:r>
+    </w:p>
+    <w:p>
+      <w:pPr>
+        <w:tabs>
+          <w:tab w:val="right" w:leader="dot" w:pos="9071"/>
+        </w:tabs>
+        <w:spacing w:after="120" w:line="312" w:lineRule="auto"/>
+      </w:pPr>
+      <w:hyperlink w:anchor="dm_hinh_10" w:history="1">
+        <w:r>
+          <w:t>Hình 2.10. Phác thảo màn hình admin tổng quan</w:t>
+        </w:r>
+      </w:hyperlink>
+      <w:r>
+        <w:tab/>
+      </w:r>
+      <w:r>
+        <w:fldChar w:fldCharType="begin"/>
+      </w:r>
+      <w:r>
+        <w:instrText xml:space="preserve"> PAGEREF dm_hinh_10 \h </w:instrText>
+      </w:r>
+      <w:r>
+        <w:fldChar w:fldCharType="separate"/>
+      </w:r>
+      <w:r>
+        <w:rPr>
+          <w:noProof/>
+        </w:rPr>
+        <w:t>39</w:t>
+      </w:r>
+      <w:r>
+        <w:fldChar w:fldCharType="end"/>
+      </w:r>
+    </w:p>
+    <w:p>
+      <w:pPr>
+        <w:tabs>
+          <w:tab w:val="right" w:leader="dot" w:pos="9071"/>
+        </w:tabs>
+        <w:spacing w:after="120" w:line="312" w:lineRule="auto"/>
+      </w:pPr>
+      <w:hyperlink w:anchor="dm_hinh_11" w:history="1">
+        <w:r>
+          <w:t>Hình 2.11. Phác thảo màn hình admin quản lý sản phẩm</w:t>
+        </w:r>
+      </w:hyperlink>
+      <w:r>
+        <w:tab/>
+      </w:r>
+      <w:r>
+        <w:fldChar w:fldCharType="begin"/>
+      </w:r>
+      <w:r>
+        <w:instrText xml:space="preserve"> PAGEREF dm_hinh_11 \h </w:instrText>
+      </w:r>
+      <w:r>
+        <w:fldChar w:fldCharType="separate"/>
+      </w:r>
+      <w:r>
+        <w:rPr>
+          <w:noProof/>
+        </w:rPr>
+        <w:t>40</w:t>
+      </w:r>
+      <w:r>
+        <w:fldChar w:fldCharType="end"/>
+      </w:r>
+    </w:p>
+    <w:p>
+      <w:pPr>
+        <w:tabs>
+          <w:tab w:val="right" w:leader="dot" w:pos="9071"/>
+        </w:tabs>
+        <w:spacing w:after="120" w:line="312" w:lineRule="auto"/>
+      </w:pPr>
+      <w:hyperlink w:anchor="dm_hinh_12" w:history="1">
+        <w:r>
+          <w:t>Hình 2.12. Phác thảo màn hình admin quản lý đơn hàng</w:t>
+        </w:r>
+      </w:hyperlink>
+      <w:r>
+        <w:tab/>
+      </w:r>
+      <w:r>
+        <w:fldChar w:fldCharType="begin"/>
+      </w:r>
+      <w:r>
+        <w:instrText xml:space="preserve"> PAGEREF dm_hinh_12 \h </w:instrText>
+      </w:r>
+      <w:r>
+        <w:fldChar w:fldCharType="separate"/>
+      </w:r>
+      <w:r>
+        <w:rPr>
+          <w:noProof/>
+        </w:rPr>
+        <w:t>40</w:t>
+      </w:r>
+      <w:r>
+        <w:fldChar w:fldCharType="end"/>
+      </w:r>
+    </w:p>
+    <w:p>
+      <w:pPr>
+        <w:tabs>
+          <w:tab w:val="right" w:leader="dot" w:pos="9071"/>
+        </w:tabs>
+        <w:spacing w:after="120" w:line="312" w:lineRule="auto"/>
+      </w:pPr>
+      <w:hyperlink w:anchor="dm_hinh_13" w:history="1">
+        <w:r>
+          <w:t>Hình 3.1. Kiến trúc triển khai dự kiến của hệ thống</w:t>
+        </w:r>
+      </w:hyperlink>
+      <w:r>
+        <w:tab/>
+      </w:r>
+      <w:r>
+        <w:fldChar w:fldCharType="begin"/>
+      </w:r>
+      <w:r>
+        <w:instrText xml:space="preserve"> PAGEREF dm_hinh_13 \h </w:instrText>
+      </w:r>
+      <w:r>
+        <w:fldChar w:fldCharType="separate"/>
+      </w:r>
+      <w:r>
+        <w:rPr>
+          <w:noProof/>
+        </w:rPr>
+        <w:t>41</w:t>
+      </w:r>
+      <w:r>
+        <w:fldChar w:fldCharType="end"/>
+      </w:r>
+    </w:p>
+    <w:p>
+      <w:pPr>
+        <w:pStyle w:val="Heading1"/>
+        <w:spacing w:after="240" w:line="312" w:lineRule="auto"/>
         <w:jc w:val="center"/>
       </w:pPr>
-      <w:r>
-        <w:rPr>
-          <w:i/>
-        </w:rPr>
-        <w:t>Hình 2.1. Biểu đồ use case tổng quát của hệ thống website bán máy tính GTech</w:t>
-      </w:r>
-    </w:p>
-    <w:p>
-      <w:pPr>
-        <w:spacing w:after="120" w:line="312" w:lineRule="auto"/>
-        <w:jc w:val="center"/>
-      </w:pPr>
-      <w:r>
-        <w:rPr>
-          <w:i/>
-        </w:rPr>
-        <w:t>Hình 2.2. Biểu đồ use case nhóm chức năng AI hỗ trợ mua bán hàng</w:t>
-      </w:r>
-    </w:p>
-    <w:p>
-      <w:pPr>
-        <w:spacing w:after="120" w:line="312" w:lineRule="auto"/>
-        <w:jc w:val="center"/>
-      </w:pPr>
-      <w:r>
-        <w:rPr>
-          <w:i/>
-        </w:rPr>
-        <w:t>Hình 2.3. Biểu đồ lớp tổng quát của hệ thống</w:t>
-      </w:r>
-    </w:p>
-    <w:p>
-      <w:pPr>
-        <w:spacing w:after="120" w:line="312" w:lineRule="auto"/>
-        <w:jc w:val="center"/>
-      </w:pPr>
-      <w:r>
-        <w:rPr>
-          <w:i/>
-        </w:rPr>
-        <w:t>Hình 2.4. Sơ đồ dữ liệu quan hệ của hệ thống</w:t>
-      </w:r>
-    </w:p>
-    <w:p>
-      <w:pPr>
-        <w:spacing w:after="120" w:line="312" w:lineRule="auto"/>
-        <w:jc w:val="center"/>
-      </w:pPr>
-      <w:r>
-        <w:rPr>
-          <w:i/>
-        </w:rPr>
-        <w:t>Hình 2.5. Phác thảo màn hình trang chủ</w:t>
-      </w:r>
-    </w:p>
-    <w:p>
-      <w:pPr>
-        <w:spacing w:after="120" w:line="312" w:lineRule="auto"/>
-        <w:jc w:val="center"/>
-      </w:pPr>
-      <w:r>
-        <w:rPr>
-          <w:i/>
-        </w:rPr>
-        <w:t>Hình 2.6. Phác thảo màn hình danh sách sản phẩm</w:t>
-      </w:r>
-    </w:p>
-    <w:p>
-      <w:pPr>
-        <w:spacing w:after="120" w:line="312" w:lineRule="auto"/>
-        <w:jc w:val="center"/>
-      </w:pPr>
-      <w:r>
-        <w:rPr>
-          <w:i/>
-        </w:rPr>
-        <w:t>Hình 2.7. Phác thảo màn hình chi tiết sản phẩm</w:t>
-      </w:r>
-    </w:p>
-    <w:p>
-      <w:pPr>
-        <w:spacing w:after="120" w:line="312" w:lineRule="auto"/>
-        <w:jc w:val="center"/>
-      </w:pPr>
-      <w:r>
-        <w:rPr>
-          <w:i/>
-        </w:rPr>
-        <w:t>Hình 2.8. Phác thảo màn hình giỏ hàng và checkout</w:t>
-      </w:r>
-    </w:p>
-    <w:p>
-      <w:pPr>
-        <w:spacing w:after="120" w:line="312" w:lineRule="auto"/>
-        <w:jc w:val="center"/>
-      </w:pPr>
-      <w:r>
-        <w:rPr>
-          <w:i/>
-        </w:rPr>
-        <w:t>Hình 2.9. Phác thảo màn hình trợ lý AI GTech</w:t>
-      </w:r>
-    </w:p>
-    <w:p>
-      <w:pPr>
-        <w:spacing w:after="120" w:line="312" w:lineRule="auto"/>
-        <w:jc w:val="center"/>
-      </w:pPr>
-      <w:r>
-        <w:rPr>
-          <w:i/>
-        </w:rPr>
-        <w:t>Hình 2.10. Phác thảo màn hình admin tổng quan</w:t>
-      </w:r>
-    </w:p>
-    <w:p>
-      <w:pPr>
-        <w:spacing w:after="120" w:line="312" w:lineRule="auto"/>
-        <w:jc w:val="center"/>
-      </w:pPr>
-      <w:r>
-        <w:rPr>
-          <w:i/>
-        </w:rPr>
-        <w:t>Hình 2.11. Phác thảo màn hình admin quản lý sản phẩm</w:t>
-      </w:r>
-    </w:p>
-    <w:p>
-      <w:pPr>
-        <w:spacing w:after="120" w:line="312" w:lineRule="auto"/>
-        <w:jc w:val="center"/>
-      </w:pPr>
-      <w:r>
-        <w:rPr>
-          <w:i/>
-        </w:rPr>
-        <w:t>Hình 2.12. Phác thảo màn hình admin quản lý đơn hàng</w:t>
-      </w:r>
-    </w:p>
-    <w:p>
-      <w:pPr>
-        <w:spacing w:after="120" w:line="312" w:lineRule="auto"/>
-        <w:jc w:val="center"/>
-      </w:pPr>
-      <w:r>
-        <w:rPr>
-          <w:i/>
-        </w:rPr>
-        <w:t>Hình 3.1. Kiến trúc triển khai dự kiến của hệ thống</w:t>
-      </w:r>
-    </w:p>
-    <w:p>
-      <w:r>
-        <w:br w:type="page"/>
-      </w:r>
-    </w:p>
-    <w:p>
-      <w:pPr>
-        <w:pStyle w:val="Heading1"/>
-        <w:spacing w:after="120" w:line="312" w:lineRule="auto"/>
-        <w:jc w:val="center"/>
-      </w:pPr>
-      <w:bookmarkStart w:id="3" w:name="_Toc230635718"/>
+      <w:bookmarkStart w:id="3" w:name="_Toc230639663"/>
       <w:r>
         <w:rPr>
           <w:rFonts w:ascii="Times New Roman" w:eastAsia="Times New Roman" w:hAnsi="Times New Roman"/>
+          <w:sz w:val="32"/>
         </w:rPr>
-        <w:lastRenderedPageBreak/>
         <w:t>DANH MỤC KÝ HIỆU, THUẬT NGỮ, TỪ VIẾT TẮT</w:t>
       </w:r>
       <w:bookmarkEnd w:id="3"/>
@@ -5204,7 +5851,7 @@
         <w:spacing w:before="60" w:after="120" w:line="312" w:lineRule="auto"/>
         <w:jc w:val="center"/>
       </w:pPr>
-      <w:bookmarkStart w:id="4" w:name="_Toc230635719"/>
+      <w:bookmarkStart w:id="4" w:name="_Toc230639664"/>
       <w:r>
         <w:rPr>
           <w:rFonts w:ascii="Times New Roman" w:eastAsia="Times New Roman" w:hAnsi="Times New Roman"/>
@@ -5219,7 +5866,7 @@
         <w:pStyle w:val="Heading2"/>
         <w:spacing w:before="60" w:after="120" w:line="312" w:lineRule="auto"/>
       </w:pPr>
-      <w:bookmarkStart w:id="5" w:name="_Toc230635720"/>
+      <w:bookmarkStart w:id="5" w:name="_Toc230639665"/>
       <w:r>
         <w:rPr>
           <w:rFonts w:ascii="Times New Roman" w:eastAsia="Times New Roman" w:hAnsi="Times New Roman"/>
@@ -5253,7 +5900,7 @@
         <w:pStyle w:val="Heading2"/>
         <w:spacing w:before="60" w:after="120" w:line="312" w:lineRule="auto"/>
       </w:pPr>
-      <w:bookmarkStart w:id="6" w:name="_Toc230635721"/>
+      <w:bookmarkStart w:id="6" w:name="_Toc230639666"/>
       <w:r>
         <w:rPr>
           <w:rFonts w:ascii="Times New Roman" w:eastAsia="Times New Roman" w:hAnsi="Times New Roman"/>
@@ -5277,7 +5924,7 @@
         <w:pStyle w:val="Heading2"/>
         <w:spacing w:before="60" w:after="120" w:line="312" w:lineRule="auto"/>
       </w:pPr>
-      <w:bookmarkStart w:id="7" w:name="_Toc230635722"/>
+      <w:bookmarkStart w:id="7" w:name="_Toc230639667"/>
       <w:r>
         <w:rPr>
           <w:rFonts w:ascii="Times New Roman" w:eastAsia="Times New Roman" w:hAnsi="Times New Roman"/>
@@ -5315,7 +5962,7 @@
         <w:pStyle w:val="Heading2"/>
         <w:spacing w:before="60" w:after="120" w:line="312" w:lineRule="auto"/>
       </w:pPr>
-      <w:bookmarkStart w:id="8" w:name="_Toc230635723"/>
+      <w:bookmarkStart w:id="8" w:name="_Toc230639668"/>
       <w:r>
         <w:rPr>
           <w:rFonts w:ascii="Times New Roman" w:eastAsia="Times New Roman" w:hAnsi="Times New Roman"/>
@@ -5440,11 +6087,10 @@
           <w:color w:val="auto"/>
         </w:rPr>
       </w:pPr>
-      <w:bookmarkStart w:id="9" w:name="_Toc230635724"/>
+      <w:bookmarkStart w:id="9" w:name="_Toc230639669"/>
       <w:r>
         <w:rPr>
           <w:rFonts w:ascii="Times New Roman" w:eastAsia="Times New Roman" w:hAnsi="Times New Roman" w:cs="Times New Roman"/>
-          <w:color w:val="auto"/>
         </w:rPr>
         <w:lastRenderedPageBreak/>
         <w:t>CHƯƠNG 1: GIỚI THIỆU TỔNG QUAN</w:t>
@@ -5460,11 +6106,10 @@
           <w:color w:val="auto"/>
         </w:rPr>
       </w:pPr>
-      <w:bookmarkStart w:id="10" w:name="_Toc230635725"/>
+      <w:bookmarkStart w:id="10" w:name="_Toc230639670"/>
       <w:r>
         <w:rPr>
           <w:rFonts w:ascii="Times New Roman" w:eastAsia="Times New Roman" w:hAnsi="Times New Roman" w:cs="Times New Roman"/>
-          <w:color w:val="auto"/>
         </w:rPr>
         <w:t>1.1. Giới thiệu chung</w:t>
       </w:r>
@@ -5480,11 +6125,10 @@
           <w:sz w:val="26"/>
         </w:rPr>
       </w:pPr>
-      <w:bookmarkStart w:id="11" w:name="_Toc230635726"/>
+      <w:bookmarkStart w:id="11" w:name="_Toc230639671"/>
       <w:r>
         <w:rPr>
           <w:rFonts w:ascii="Times New Roman" w:eastAsia="Times New Roman" w:hAnsi="Times New Roman" w:cs="Times New Roman"/>
-          <w:color w:val="auto"/>
           <w:sz w:val="26"/>
         </w:rPr>
         <w:t>1.1.1. Tổng quan về thương mại điện tử</w:t>
@@ -5545,11 +6189,10 @@
           <w:sz w:val="26"/>
         </w:rPr>
       </w:pPr>
-      <w:bookmarkStart w:id="12" w:name="_Toc230635727"/>
+      <w:bookmarkStart w:id="12" w:name="_Toc230639672"/>
       <w:r>
         <w:rPr>
           <w:rFonts w:ascii="Times New Roman" w:eastAsia="Times New Roman" w:hAnsi="Times New Roman" w:cs="Times New Roman"/>
-          <w:color w:val="auto"/>
           <w:sz w:val="26"/>
         </w:rPr>
         <w:t>1.1.2. Đặc điểm của thương mại điện tử trong lĩnh vực máy tính và linh kiện</w:t>
@@ -5610,11 +6253,10 @@
           <w:sz w:val="26"/>
         </w:rPr>
       </w:pPr>
-      <w:bookmarkStart w:id="13" w:name="_Toc230635728"/>
+      <w:bookmarkStart w:id="13" w:name="_Toc230639673"/>
       <w:r>
         <w:rPr>
           <w:rFonts w:ascii="Times New Roman" w:eastAsia="Times New Roman" w:hAnsi="Times New Roman" w:cs="Times New Roman"/>
-          <w:color w:val="auto"/>
           <w:sz w:val="26"/>
         </w:rPr>
         <w:t>1.1.3. Thuận lợi khi ứng dụng thương mại điện tử</w:t>
@@ -5671,11 +6313,10 @@
           <w:sz w:val="26"/>
         </w:rPr>
       </w:pPr>
-      <w:bookmarkStart w:id="14" w:name="_Toc230635729"/>
+      <w:bookmarkStart w:id="14" w:name="_Toc230639674"/>
       <w:r>
         <w:rPr>
           <w:rFonts w:ascii="Times New Roman" w:eastAsia="Times New Roman" w:hAnsi="Times New Roman" w:cs="Times New Roman"/>
-          <w:color w:val="auto"/>
           <w:sz w:val="26"/>
         </w:rPr>
         <w:t>1.1.4. Khó khăn và thách thức khi triển khai thương mại điện tử</w:t>
@@ -5736,11 +6377,10 @@
           <w:sz w:val="26"/>
         </w:rPr>
       </w:pPr>
-      <w:bookmarkStart w:id="15" w:name="_Toc230635730"/>
+      <w:bookmarkStart w:id="15" w:name="_Toc230639675"/>
       <w:r>
         <w:rPr>
           <w:rFonts w:ascii="Times New Roman" w:eastAsia="Times New Roman" w:hAnsi="Times New Roman" w:cs="Times New Roman"/>
-          <w:color w:val="auto"/>
           <w:sz w:val="26"/>
         </w:rPr>
         <w:t>1.1.5. Giới thiệu về công ty GTech và định hướng xây dựng website</w:t>
@@ -5800,6 +6440,7 @@
           <w:i/>
         </w:rPr>
       </w:pPr>
+      <w:bookmarkStart w:id="16" w:name="dm_bang_1"/>
       <w:r>
         <w:rPr>
           <w:rFonts w:cs="Times New Roman"/>
@@ -5807,6 +6448,7 @@
         </w:rPr>
         <w:t>Bảng 1.1. Một số thuận lợi và khó khăn khi ứng dụng thương mại điện tử trong lĩnh vực bán máy tính</w:t>
       </w:r>
+      <w:bookmarkEnd w:id="16"/>
     </w:p>
     <w:tbl>
       <w:tblPr>
@@ -6128,16 +6770,15 @@
           <w:color w:val="auto"/>
         </w:rPr>
       </w:pPr>
-      <w:bookmarkStart w:id="16" w:name="_Toc230635731"/>
+      <w:bookmarkStart w:id="17" w:name="_Toc230639676"/>
       <w:r>
         <w:rPr>
           <w:rFonts w:ascii="Times New Roman" w:eastAsia="Times New Roman" w:hAnsi="Times New Roman" w:cs="Times New Roman"/>
-          <w:color w:val="auto"/>
         </w:rPr>
         <w:lastRenderedPageBreak/>
         <w:t>1.2. Nghiên cứu hiện trạng và giải quyết vấn đề</w:t>
       </w:r>
-      <w:bookmarkEnd w:id="16"/>
+      <w:bookmarkEnd w:id="17"/>
     </w:p>
     <w:p>
       <w:pPr>
@@ -6149,16 +6790,15 @@
           <w:sz w:val="26"/>
         </w:rPr>
       </w:pPr>
-      <w:bookmarkStart w:id="17" w:name="_Toc230635732"/>
+      <w:bookmarkStart w:id="18" w:name="_Toc230639677"/>
       <w:r>
         <w:rPr>
           <w:rFonts w:ascii="Times New Roman" w:eastAsia="Times New Roman" w:hAnsi="Times New Roman" w:cs="Times New Roman"/>
-          <w:color w:val="auto"/>
           <w:sz w:val="26"/>
         </w:rPr>
         <w:t>1.2.1. Hiện trạng hoạt động kinh doanh của GTech</w:t>
       </w:r>
-      <w:bookmarkEnd w:id="17"/>
+      <w:bookmarkEnd w:id="18"/>
     </w:p>
     <w:p>
       <w:pPr>
@@ -6200,16 +6840,15 @@
           <w:sz w:val="26"/>
         </w:rPr>
       </w:pPr>
-      <w:bookmarkStart w:id="18" w:name="_Toc230635733"/>
+      <w:bookmarkStart w:id="19" w:name="_Toc230639678"/>
       <w:r>
         <w:rPr>
           <w:rFonts w:ascii="Times New Roman" w:eastAsia="Times New Roman" w:hAnsi="Times New Roman" w:cs="Times New Roman"/>
-          <w:color w:val="auto"/>
           <w:sz w:val="26"/>
         </w:rPr>
         <w:t>1.2.2. Cơ cấu tổ chức liên quan đến hệ thống</w:t>
       </w:r>
-      <w:bookmarkEnd w:id="18"/>
+      <w:bookmarkEnd w:id="19"/>
     </w:p>
     <w:p>
       <w:pPr>
@@ -6245,16 +6884,15 @@
           <w:sz w:val="26"/>
         </w:rPr>
       </w:pPr>
-      <w:bookmarkStart w:id="19" w:name="_Toc230635734"/>
+      <w:bookmarkStart w:id="20" w:name="_Toc230639679"/>
       <w:r>
         <w:rPr>
           <w:rFonts w:ascii="Times New Roman" w:eastAsia="Times New Roman" w:hAnsi="Times New Roman" w:cs="Times New Roman"/>
-          <w:color w:val="auto"/>
           <w:sz w:val="26"/>
         </w:rPr>
         <w:t>1.2.3. Mô tả hoạt động của các bộ phận</w:t>
       </w:r>
-      <w:bookmarkEnd w:id="19"/>
+      <w:bookmarkEnd w:id="20"/>
     </w:p>
     <w:p>
       <w:pPr>
@@ -6306,16 +6944,15 @@
           <w:sz w:val="26"/>
         </w:rPr>
       </w:pPr>
-      <w:bookmarkStart w:id="20" w:name="_Toc230635735"/>
+      <w:bookmarkStart w:id="21" w:name="_Toc230639680"/>
       <w:r>
         <w:rPr>
           <w:rFonts w:ascii="Times New Roman" w:eastAsia="Times New Roman" w:hAnsi="Times New Roman" w:cs="Times New Roman"/>
-          <w:color w:val="auto"/>
           <w:sz w:val="26"/>
         </w:rPr>
         <w:t>1.2.4. Các vấn đề tồn tại</w:t>
       </w:r>
-      <w:bookmarkEnd w:id="20"/>
+      <w:bookmarkEnd w:id="21"/>
     </w:p>
     <w:p>
       <w:pPr>
@@ -6361,16 +6998,15 @@
           <w:sz w:val="26"/>
         </w:rPr>
       </w:pPr>
-      <w:bookmarkStart w:id="21" w:name="_Toc230635736"/>
+      <w:bookmarkStart w:id="22" w:name="_Toc230639681"/>
       <w:r>
         <w:rPr>
           <w:rFonts w:ascii="Times New Roman" w:eastAsia="Times New Roman" w:hAnsi="Times New Roman" w:cs="Times New Roman"/>
-          <w:color w:val="auto"/>
           <w:sz w:val="26"/>
         </w:rPr>
         <w:t>1.2.5. Định hướng giải quyết</w:t>
       </w:r>
-      <w:bookmarkEnd w:id="21"/>
+      <w:bookmarkEnd w:id="22"/>
     </w:p>
     <w:p>
       <w:pPr>
@@ -6426,16 +7062,15 @@
           <w:sz w:val="26"/>
         </w:rPr>
       </w:pPr>
-      <w:bookmarkStart w:id="22" w:name="_Toc230635737"/>
+      <w:bookmarkStart w:id="23" w:name="_Toc230639682"/>
       <w:r>
         <w:rPr>
           <w:rFonts w:ascii="Times New Roman" w:eastAsia="Times New Roman" w:hAnsi="Times New Roman" w:cs="Times New Roman"/>
-          <w:color w:val="auto"/>
           <w:sz w:val="26"/>
         </w:rPr>
         <w:t>1.2.6. Xác định yêu cầu hệ thống</w:t>
       </w:r>
-      <w:bookmarkEnd w:id="22"/>
+      <w:bookmarkEnd w:id="23"/>
     </w:p>
     <w:p>
       <w:pPr>
@@ -6456,6 +7091,7 @@
           <w:i/>
         </w:rPr>
       </w:pPr>
+      <w:bookmarkStart w:id="24" w:name="dm_bang_2"/>
       <w:r>
         <w:rPr>
           <w:rFonts w:cs="Times New Roman"/>
@@ -6463,6 +7099,7 @@
         </w:rPr>
         <w:t>Bảng 1.2. Nhóm yêu cầu chính của hệ thống website bán máy tính GTech</w:t>
       </w:r>
+      <w:bookmarkEnd w:id="24"/>
     </w:p>
     <w:tbl>
       <w:tblPr>
@@ -6851,15 +7488,14 @@
           <w:color w:val="auto"/>
         </w:rPr>
       </w:pPr>
-      <w:bookmarkStart w:id="23" w:name="_Toc230635738"/>
+      <w:bookmarkStart w:id="25" w:name="_Toc230639683"/>
       <w:r>
         <w:rPr>
           <w:rFonts w:ascii="Times New Roman" w:eastAsia="Times New Roman" w:hAnsi="Times New Roman" w:cs="Times New Roman"/>
-          <w:color w:val="auto"/>
         </w:rPr>
         <w:t>1.3. Giới thiệu về công nghệ, ngôn ngữ sử dụng</w:t>
       </w:r>
-      <w:bookmarkEnd w:id="23"/>
+      <w:bookmarkEnd w:id="25"/>
     </w:p>
     <w:p>
       <w:pPr>
@@ -6891,16 +7527,15 @@
           <w:sz w:val="26"/>
         </w:rPr>
       </w:pPr>
-      <w:bookmarkStart w:id="24" w:name="_Toc230635739"/>
+      <w:bookmarkStart w:id="26" w:name="_Toc230639684"/>
       <w:r>
         <w:rPr>
           <w:rFonts w:ascii="Times New Roman" w:eastAsia="Times New Roman" w:hAnsi="Times New Roman" w:cs="Times New Roman"/>
-          <w:color w:val="auto"/>
           <w:sz w:val="26"/>
         </w:rPr>
         <w:t>1.3.1. Ngôn ngữ JavaScript và TypeScript</w:t>
       </w:r>
-      <w:bookmarkEnd w:id="24"/>
+      <w:bookmarkEnd w:id="26"/>
     </w:p>
     <w:p>
       <w:pPr>
@@ -6933,16 +7568,15 @@
           <w:sz w:val="26"/>
         </w:rPr>
       </w:pPr>
-      <w:bookmarkStart w:id="25" w:name="_Toc230635740"/>
+      <w:bookmarkStart w:id="27" w:name="_Toc230639685"/>
       <w:r>
         <w:rPr>
           <w:rFonts w:ascii="Times New Roman" w:eastAsia="Times New Roman" w:hAnsi="Times New Roman" w:cs="Times New Roman"/>
-          <w:color w:val="auto"/>
           <w:sz w:val="26"/>
         </w:rPr>
         <w:t>1.3.2. Công nghệ Next.js cho giao diện người dùng</w:t>
       </w:r>
-      <w:bookmarkEnd w:id="25"/>
+      <w:bookmarkEnd w:id="27"/>
     </w:p>
     <w:p>
       <w:pPr>
@@ -6974,16 +7608,15 @@
           <w:sz w:val="26"/>
         </w:rPr>
       </w:pPr>
-      <w:bookmarkStart w:id="26" w:name="_Toc230635741"/>
+      <w:bookmarkStart w:id="28" w:name="_Toc230639686"/>
       <w:r>
         <w:rPr>
           <w:rFonts w:ascii="Times New Roman" w:eastAsia="Times New Roman" w:hAnsi="Times New Roman" w:cs="Times New Roman"/>
-          <w:color w:val="auto"/>
           <w:sz w:val="26"/>
         </w:rPr>
         <w:t>1.3.3. Công nghệ NestJS cho backend</w:t>
       </w:r>
-      <w:bookmarkEnd w:id="26"/>
+      <w:bookmarkEnd w:id="28"/>
     </w:p>
     <w:p>
       <w:pPr>
@@ -7016,16 +7649,15 @@
           <w:sz w:val="26"/>
         </w:rPr>
       </w:pPr>
-      <w:bookmarkStart w:id="27" w:name="_Toc230635742"/>
+      <w:bookmarkStart w:id="29" w:name="_Toc230639687"/>
       <w:r>
         <w:rPr>
           <w:rFonts w:ascii="Times New Roman" w:eastAsia="Times New Roman" w:hAnsi="Times New Roman" w:cs="Times New Roman"/>
-          <w:color w:val="auto"/>
           <w:sz w:val="26"/>
         </w:rPr>
         <w:t>1.3.4. Cơ sở dữ liệu PostgreSQL hoặc MySQL</w:t>
       </w:r>
-      <w:bookmarkEnd w:id="27"/>
+      <w:bookmarkEnd w:id="29"/>
     </w:p>
     <w:p>
       <w:pPr>
@@ -7057,16 +7689,15 @@
           <w:sz w:val="26"/>
         </w:rPr>
       </w:pPr>
-      <w:bookmarkStart w:id="28" w:name="_Toc230635743"/>
+      <w:bookmarkStart w:id="30" w:name="_Toc230639688"/>
       <w:r>
         <w:rPr>
           <w:rFonts w:ascii="Times New Roman" w:eastAsia="Times New Roman" w:hAnsi="Times New Roman" w:cs="Times New Roman"/>
-          <w:color w:val="auto"/>
           <w:sz w:val="26"/>
         </w:rPr>
         <w:t>1.3.5. OpenAI API, mô hình GPT và AI Agent</w:t>
       </w:r>
-      <w:bookmarkEnd w:id="28"/>
+      <w:bookmarkEnd w:id="30"/>
     </w:p>
     <w:p>
       <w:pPr>
@@ -7102,16 +7733,15 @@
           <w:sz w:val="26"/>
         </w:rPr>
       </w:pPr>
-      <w:bookmarkStart w:id="29" w:name="_Toc230635744"/>
+      <w:bookmarkStart w:id="31" w:name="_Toc230639689"/>
       <w:r>
         <w:rPr>
           <w:rFonts w:ascii="Times New Roman" w:eastAsia="Times New Roman" w:hAnsi="Times New Roman" w:cs="Times New Roman"/>
-          <w:color w:val="auto"/>
           <w:sz w:val="26"/>
         </w:rPr>
         <w:t>1.3.6. Công cụ phát triển và quản lý mã nguồn</w:t>
       </w:r>
-      <w:bookmarkEnd w:id="29"/>
+      <w:bookmarkEnd w:id="31"/>
     </w:p>
     <w:p>
       <w:pPr>
@@ -7142,15 +7772,14 @@
           <w:color w:val="auto"/>
         </w:rPr>
       </w:pPr>
-      <w:bookmarkStart w:id="30" w:name="_Toc230635745"/>
+      <w:bookmarkStart w:id="32" w:name="_Toc230639690"/>
       <w:r>
         <w:rPr>
           <w:rFonts w:ascii="Times New Roman" w:eastAsia="Times New Roman" w:hAnsi="Times New Roman" w:cs="Times New Roman"/>
-          <w:color w:val="auto"/>
         </w:rPr>
         <w:t>1.4. Kết luận chương 1</w:t>
       </w:r>
-      <w:bookmarkEnd w:id="30"/>
+      <w:bookmarkEnd w:id="32"/>
     </w:p>
     <w:p>
       <w:pPr>
@@ -7190,16 +7819,15 @@
           <w:color w:val="auto"/>
         </w:rPr>
       </w:pPr>
-      <w:bookmarkStart w:id="31" w:name="_Toc230635746"/>
+      <w:bookmarkStart w:id="33" w:name="_Toc230639691"/>
       <w:r>
         <w:rPr>
           <w:rFonts w:ascii="Times New Roman" w:eastAsia="Times New Roman" w:hAnsi="Times New Roman"/>
-          <w:color w:val="auto"/>
         </w:rPr>
         <w:lastRenderedPageBreak/>
         <w:t>CHƯƠNG 2: PHÂN TÍCH THIẾT KẾ HỆ THỐNG</w:t>
       </w:r>
-      <w:bookmarkEnd w:id="31"/>
+      <w:bookmarkEnd w:id="33"/>
     </w:p>
     <w:tbl>
       <w:tblPr>
@@ -7579,15 +8207,14 @@
           <w:color w:val="auto"/>
         </w:rPr>
       </w:pPr>
-      <w:bookmarkStart w:id="32" w:name="_Toc230635747"/>
+      <w:bookmarkStart w:id="34" w:name="_Toc230639692"/>
       <w:r>
         <w:rPr>
           <w:rFonts w:ascii="Times New Roman" w:eastAsia="Times New Roman" w:hAnsi="Times New Roman"/>
-          <w:color w:val="auto"/>
         </w:rPr>
         <w:t>2.1. Khảo sát hệ thống</w:t>
       </w:r>
-      <w:bookmarkEnd w:id="32"/>
+      <w:bookmarkEnd w:id="34"/>
     </w:p>
     <w:p>
       <w:pPr>
@@ -7607,16 +8234,15 @@
           <w:color w:val="auto"/>
         </w:rPr>
       </w:pPr>
-      <w:bookmarkStart w:id="33" w:name="_Toc230635748"/>
+      <w:bookmarkStart w:id="35" w:name="_Toc230639693"/>
       <w:r>
         <w:rPr>
           <w:rFonts w:ascii="Times New Roman" w:eastAsia="Times New Roman" w:hAnsi="Times New Roman"/>
-          <w:color w:val="auto"/>
           <w:sz w:val="26"/>
         </w:rPr>
         <w:t>2.1.1. Khảo sát sơ bộ</w:t>
       </w:r>
-      <w:bookmarkEnd w:id="33"/>
+      <w:bookmarkEnd w:id="35"/>
     </w:p>
     <w:p>
       <w:pPr>
@@ -7654,6 +8280,7 @@
         <w:spacing w:after="120" w:line="312" w:lineRule="auto"/>
         <w:jc w:val="center"/>
       </w:pPr>
+      <w:bookmarkStart w:id="36" w:name="dm_bang_3"/>
       <w:r>
         <w:rPr>
           <w:i/>
@@ -7661,6 +8288,7 @@
         <w:lastRenderedPageBreak/>
         <w:t>Bảng 2.1. Khảo sát sơ bộ hệ thống</w:t>
       </w:r>
+      <w:bookmarkEnd w:id="36"/>
     </w:p>
     <w:tbl>
       <w:tblPr>
@@ -7889,16 +8517,15 @@
           <w:color w:val="auto"/>
         </w:rPr>
       </w:pPr>
-      <w:bookmarkStart w:id="34" w:name="_Toc230635749"/>
+      <w:bookmarkStart w:id="37" w:name="_Toc230639694"/>
       <w:r>
         <w:rPr>
           <w:rFonts w:ascii="Times New Roman" w:eastAsia="Times New Roman" w:hAnsi="Times New Roman"/>
-          <w:color w:val="auto"/>
           <w:sz w:val="26"/>
         </w:rPr>
         <w:t>2.1.2. Khảo sát chi tiết</w:t>
       </w:r>
-      <w:bookmarkEnd w:id="34"/>
+      <w:bookmarkEnd w:id="37"/>
     </w:p>
     <w:p>
       <w:pPr>
@@ -7957,6 +8584,7 @@
         <w:spacing w:after="120" w:line="312" w:lineRule="auto"/>
         <w:jc w:val="center"/>
       </w:pPr>
+      <w:bookmarkStart w:id="38" w:name="dm_bang_4"/>
       <w:r>
         <w:rPr>
           <w:i/>
@@ -7964,6 +8592,7 @@
         <w:lastRenderedPageBreak/>
         <w:t>Bảng 2.2. Bảng hỏi khảo sát yêu cầu chức năng</w:t>
       </w:r>
+      <w:bookmarkEnd w:id="38"/>
     </w:p>
     <w:tbl>
       <w:tblPr>
@@ -8421,6 +9050,7 @@
         <w:spacing w:after="120" w:line="312" w:lineRule="auto"/>
         <w:jc w:val="center"/>
       </w:pPr>
+      <w:bookmarkStart w:id="39" w:name="dm_bang_5"/>
       <w:r>
         <w:rPr>
           <w:i/>
@@ -8428,6 +9058,7 @@
         <w:lastRenderedPageBreak/>
         <w:t>Bảng 2.3. Bảng hỏi khảo sát yêu cầu phi chức năng</w:t>
       </w:r>
+      <w:bookmarkEnd w:id="39"/>
     </w:p>
     <w:tbl>
       <w:tblPr>
@@ -8807,16 +9438,15 @@
           <w:color w:val="auto"/>
         </w:rPr>
       </w:pPr>
-      <w:bookmarkStart w:id="35" w:name="_Toc230635750"/>
+      <w:bookmarkStart w:id="40" w:name="_Toc230639695"/>
       <w:r>
         <w:rPr>
           <w:rFonts w:ascii="Times New Roman" w:eastAsia="Times New Roman" w:hAnsi="Times New Roman"/>
-          <w:color w:val="auto"/>
           <w:sz w:val="26"/>
         </w:rPr>
         <w:t>2.1.3. Nhận xét sau khảo sát</w:t>
       </w:r>
-      <w:bookmarkEnd w:id="35"/>
+      <w:bookmarkEnd w:id="40"/>
     </w:p>
     <w:p>
       <w:pPr>
@@ -8836,22 +9466,20 @@
           <w:color w:val="auto"/>
         </w:rPr>
       </w:pPr>
-      <w:bookmarkStart w:id="36" w:name="_Toc230635751"/>
+      <w:bookmarkStart w:id="41" w:name="_Toc230639696"/>
       <w:r>
         <w:rPr>
           <w:rFonts w:ascii="Times New Roman" w:eastAsia="Times New Roman" w:hAnsi="Times New Roman"/>
-          <w:color w:val="auto"/>
         </w:rPr>
         <w:t>2.2</w:t>
       </w:r>
       <w:r>
         <w:rPr>
           <w:rFonts w:ascii="Times New Roman" w:eastAsia="Times New Roman" w:hAnsi="Times New Roman"/>
-          <w:color w:val="auto"/>
         </w:rPr>
         <w:t>. Xác định các tác nhân của hệ thống và ca sử dụng</w:t>
       </w:r>
-      <w:bookmarkEnd w:id="36"/>
+      <w:bookmarkEnd w:id="41"/>
     </w:p>
     <w:p>
       <w:pPr>
@@ -8872,12 +9500,14 @@
         <w:spacing w:after="120" w:line="312" w:lineRule="auto"/>
         <w:jc w:val="center"/>
       </w:pPr>
+      <w:bookmarkStart w:id="42" w:name="dm_bang_6"/>
       <w:r>
         <w:rPr>
           <w:i/>
         </w:rPr>
         <w:t>Bảng 2.4. Danh sách tác nhân của hệ thống</w:t>
       </w:r>
+      <w:bookmarkEnd w:id="42"/>
     </w:p>
     <w:tbl>
       <w:tblPr>
@@ -9316,16 +9946,15 @@
           <w:color w:val="auto"/>
         </w:rPr>
       </w:pPr>
-      <w:bookmarkStart w:id="37" w:name="_Toc230635752"/>
+      <w:bookmarkStart w:id="43" w:name="_Toc230639697"/>
       <w:r>
         <w:rPr>
           <w:rFonts w:ascii="Times New Roman" w:eastAsia="Times New Roman" w:hAnsi="Times New Roman"/>
-          <w:color w:val="auto"/>
           <w:sz w:val="26"/>
         </w:rPr>
         <w:t>2.2.1. Nhóm ca sử dụng của khách hàng</w:t>
       </w:r>
-      <w:bookmarkEnd w:id="37"/>
+      <w:bookmarkEnd w:id="43"/>
     </w:p>
     <w:p>
       <w:pPr>
@@ -9349,16 +9978,15 @@
           <w:color w:val="auto"/>
         </w:rPr>
       </w:pPr>
-      <w:bookmarkStart w:id="38" w:name="_Toc230635753"/>
+      <w:bookmarkStart w:id="44" w:name="_Toc230639698"/>
       <w:r>
         <w:rPr>
           <w:rFonts w:ascii="Times New Roman" w:eastAsia="Times New Roman" w:hAnsi="Times New Roman"/>
-          <w:color w:val="auto"/>
           <w:sz w:val="26"/>
         </w:rPr>
         <w:t>2.2.2. Nhóm ca sử dụng của quản trị viên và nhân viên</w:t>
       </w:r>
-      <w:bookmarkEnd w:id="38"/>
+      <w:bookmarkEnd w:id="44"/>
     </w:p>
     <w:p>
       <w:pPr>
@@ -9378,16 +10006,15 @@
           <w:color w:val="auto"/>
         </w:rPr>
       </w:pPr>
-      <w:bookmarkStart w:id="39" w:name="_Toc230635754"/>
+      <w:bookmarkStart w:id="45" w:name="_Toc230639699"/>
       <w:r>
         <w:rPr>
           <w:rFonts w:ascii="Times New Roman" w:eastAsia="Times New Roman" w:hAnsi="Times New Roman"/>
-          <w:color w:val="auto"/>
           <w:sz w:val="26"/>
         </w:rPr>
         <w:t>2.2.3. Nhóm ca sử dụng của AI hỗ trợ mua bán hàng</w:t>
       </w:r>
-      <w:bookmarkEnd w:id="39"/>
+      <w:bookmarkEnd w:id="45"/>
     </w:p>
     <w:p>
       <w:pPr>
@@ -9407,15 +10034,14 @@
           <w:color w:val="auto"/>
         </w:rPr>
       </w:pPr>
-      <w:bookmarkStart w:id="40" w:name="_Toc230635755"/>
+      <w:bookmarkStart w:id="46" w:name="_Toc230639700"/>
       <w:r>
         <w:rPr>
           <w:rFonts w:ascii="Times New Roman" w:eastAsia="Times New Roman" w:hAnsi="Times New Roman"/>
-          <w:color w:val="auto"/>
         </w:rPr>
         <w:t>2.3. Các biểu đồ use case</w:t>
       </w:r>
-      <w:bookmarkEnd w:id="40"/>
+      <w:bookmarkEnd w:id="46"/>
     </w:p>
     <w:p>
       <w:pPr>
@@ -9437,7 +10063,7 @@
         </w:rPr>
         <w:lastRenderedPageBreak/>
         <w:drawing>
-          <wp:inline distT="0" distB="0" distL="0" distR="0" wp14:anchorId="6100E275" wp14:editId="79FC9C56">
+          <wp:inline distT="0" distB="0" distL="0" distR="0" wp14:anchorId="366A4E00" wp14:editId="273F2F3E">
             <wp:extent cx="5580000" cy="3487500"/>
             <wp:effectExtent l="0" t="0" r="0" b="0"/>
             <wp:docPr id="1" name="Picture 1"/>
@@ -9478,12 +10104,14 @@
         <w:spacing w:after="120" w:line="312" w:lineRule="auto"/>
         <w:jc w:val="center"/>
       </w:pPr>
+      <w:bookmarkStart w:id="47" w:name="dm_hinh_1"/>
       <w:r>
         <w:rPr>
           <w:i/>
         </w:rPr>
         <w:t>Hình 2.1. Biểu đồ use case tổng quát của hệ thống website bán máy tính GTech</w:t>
       </w:r>
+      <w:bookmarkEnd w:id="47"/>
     </w:p>
     <w:p>
       <w:pPr>
@@ -9507,7 +10135,7 @@
         </w:rPr>
         <w:lastRenderedPageBreak/>
         <w:drawing>
-          <wp:inline distT="0" distB="0" distL="0" distR="0" wp14:anchorId="6B06766B" wp14:editId="71F9C55A">
+          <wp:inline distT="0" distB="0" distL="0" distR="0" wp14:anchorId="3E041DD0" wp14:editId="3EF8888F">
             <wp:extent cx="5580000" cy="3348000"/>
             <wp:effectExtent l="0" t="0" r="0" b="0"/>
             <wp:docPr id="2" name="Picture 2"/>
@@ -9548,12 +10176,14 @@
         <w:spacing w:after="120" w:line="312" w:lineRule="auto"/>
         <w:jc w:val="center"/>
       </w:pPr>
+      <w:bookmarkStart w:id="48" w:name="dm_hinh_2"/>
       <w:r>
         <w:rPr>
           <w:i/>
         </w:rPr>
         <w:t>Hình 2.2. Biểu đồ use case nhóm chức năng AI hỗ trợ mua bán hàng</w:t>
       </w:r>
+      <w:bookmarkEnd w:id="48"/>
     </w:p>
     <w:p>
       <w:pPr>
@@ -9580,16 +10210,15 @@
           <w:color w:val="auto"/>
         </w:rPr>
       </w:pPr>
-      <w:bookmarkStart w:id="41" w:name="_Toc230635756"/>
+      <w:bookmarkStart w:id="49" w:name="_Toc230639701"/>
       <w:r>
         <w:rPr>
           <w:rFonts w:ascii="Times New Roman" w:eastAsia="Times New Roman" w:hAnsi="Times New Roman"/>
-          <w:color w:val="auto"/>
         </w:rPr>
         <w:lastRenderedPageBreak/>
         <w:t>2.4. Mô tả chi tiết các use case</w:t>
       </w:r>
-      <w:bookmarkEnd w:id="41"/>
+      <w:bookmarkEnd w:id="49"/>
     </w:p>
     <w:p>
       <w:pPr>
@@ -9606,12 +10235,14 @@
         <w:spacing w:after="120" w:line="312" w:lineRule="auto"/>
         <w:jc w:val="center"/>
       </w:pPr>
+      <w:bookmarkStart w:id="50" w:name="dm_bang_7"/>
       <w:r>
         <w:rPr>
           <w:i/>
         </w:rPr>
         <w:t>Bảng 2.5. Mô tả use case tìm kiếm và lọc sản phẩm</w:t>
       </w:r>
+      <w:bookmarkEnd w:id="50"/>
     </w:p>
     <w:tbl>
       <w:tblPr>
@@ -9968,6 +10599,7 @@
         <w:spacing w:after="120" w:line="312" w:lineRule="auto"/>
         <w:jc w:val="center"/>
       </w:pPr>
+      <w:bookmarkStart w:id="51" w:name="dm_bang_8"/>
       <w:r>
         <w:rPr>
           <w:i/>
@@ -9975,6 +10607,7 @@
         <w:lastRenderedPageBreak/>
         <w:t>Bảng 2.6. Mô tả use case tư vấn sản phẩm bằng AI</w:t>
       </w:r>
+      <w:bookmarkEnd w:id="51"/>
     </w:p>
     <w:tbl>
       <w:tblPr>
@@ -10241,12 +10874,14 @@
         <w:spacing w:after="120" w:line="312" w:lineRule="auto"/>
         <w:jc w:val="center"/>
       </w:pPr>
+      <w:bookmarkStart w:id="52" w:name="dm_bang_9"/>
       <w:r>
         <w:rPr>
           <w:i/>
         </w:rPr>
         <w:t>Bảng 2.7. Mô tả use case đặt hàng</w:t>
       </w:r>
+      <w:bookmarkEnd w:id="52"/>
     </w:p>
     <w:tbl>
       <w:tblPr>
@@ -10516,15 +11151,14 @@
           <w:color w:val="auto"/>
         </w:rPr>
       </w:pPr>
-      <w:bookmarkStart w:id="42" w:name="_Toc230635757"/>
+      <w:bookmarkStart w:id="53" w:name="_Toc230639702"/>
       <w:r>
         <w:rPr>
           <w:rFonts w:ascii="Times New Roman" w:eastAsia="Times New Roman" w:hAnsi="Times New Roman"/>
-          <w:color w:val="auto"/>
         </w:rPr>
         <w:t>2.5. Thiết kế biểu đồ lớp</w:t>
       </w:r>
-      <w:bookmarkEnd w:id="42"/>
+      <w:bookmarkEnd w:id="53"/>
     </w:p>
     <w:p>
       <w:pPr>
@@ -10549,7 +11183,7 @@
           <w:noProof/>
         </w:rPr>
         <w:drawing>
-          <wp:inline distT="0" distB="0" distL="0" distR="0" wp14:anchorId="16150FD9" wp14:editId="410DBEF0">
+          <wp:inline distT="0" distB="0" distL="0" distR="0" wp14:anchorId="5F9BA12D" wp14:editId="70832345">
             <wp:extent cx="5580000" cy="3282353"/>
             <wp:effectExtent l="0" t="0" r="0" b="0"/>
             <wp:docPr id="3" name="Picture 3"/>
@@ -10590,12 +11224,14 @@
         <w:spacing w:after="120" w:line="312" w:lineRule="auto"/>
         <w:jc w:val="center"/>
       </w:pPr>
+      <w:bookmarkStart w:id="54" w:name="dm_hinh_3"/>
       <w:r>
         <w:rPr>
           <w:i/>
         </w:rPr>
         <w:t>Hình 2.3. Biểu đồ lớp tổng quát của hệ thống</w:t>
       </w:r>
+      <w:bookmarkEnd w:id="54"/>
     </w:p>
     <w:p>
       <w:pPr>
@@ -10615,15 +11251,14 @@
           <w:color w:val="auto"/>
         </w:rPr>
       </w:pPr>
-      <w:bookmarkStart w:id="43" w:name="_Toc230635758"/>
+      <w:bookmarkStart w:id="55" w:name="_Toc230639703"/>
       <w:r>
         <w:rPr>
           <w:rFonts w:ascii="Times New Roman" w:eastAsia="Times New Roman" w:hAnsi="Times New Roman"/>
-          <w:color w:val="auto"/>
         </w:rPr>
         <w:t>2.6. Cơ sở dữ liệu</w:t>
       </w:r>
-      <w:bookmarkEnd w:id="43"/>
+      <w:bookmarkEnd w:id="55"/>
     </w:p>
     <w:p>
       <w:pPr>
@@ -10633,16 +11268,15 @@
           <w:color w:val="auto"/>
         </w:rPr>
       </w:pPr>
-      <w:bookmarkStart w:id="44" w:name="_Toc230635759"/>
+      <w:bookmarkStart w:id="56" w:name="_Toc230639704"/>
       <w:r>
         <w:rPr>
           <w:rFonts w:ascii="Times New Roman" w:eastAsia="Times New Roman" w:hAnsi="Times New Roman"/>
-          <w:color w:val="auto"/>
           <w:sz w:val="26"/>
         </w:rPr>
         <w:t>2.6.1. Sơ đồ dữ liệu quan hệ</w:t>
       </w:r>
-      <w:bookmarkEnd w:id="44"/>
+      <w:bookmarkEnd w:id="56"/>
     </w:p>
     <w:p>
       <w:pPr>
@@ -10666,7 +11300,7 @@
         </w:rPr>
         <w:lastRenderedPageBreak/>
         <w:drawing>
-          <wp:inline distT="0" distB="0" distL="0" distR="0" wp14:anchorId="4762E57D" wp14:editId="380AC041">
+          <wp:inline distT="0" distB="0" distL="0" distR="0" wp14:anchorId="71ED0BCB" wp14:editId="2DEA6328">
             <wp:extent cx="5580000" cy="3446471"/>
             <wp:effectExtent l="0" t="0" r="0" b="0"/>
             <wp:docPr id="4" name="Picture 4"/>
@@ -10707,12 +11341,14 @@
         <w:spacing w:after="120" w:line="312" w:lineRule="auto"/>
         <w:jc w:val="center"/>
       </w:pPr>
+      <w:bookmarkStart w:id="57" w:name="dm_hinh_4"/>
       <w:r>
         <w:rPr>
           <w:i/>
         </w:rPr>
         <w:t>Hình 2.4. Sơ đồ dữ liệu quan hệ của hệ thống</w:t>
       </w:r>
+      <w:bookmarkEnd w:id="57"/>
     </w:p>
     <w:p>
       <w:pPr>
@@ -10722,28 +11358,29 @@
           <w:color w:val="auto"/>
         </w:rPr>
       </w:pPr>
-      <w:bookmarkStart w:id="45" w:name="_Toc230635760"/>
+      <w:bookmarkStart w:id="58" w:name="_Toc230639705"/>
       <w:r>
         <w:rPr>
           <w:rFonts w:ascii="Times New Roman" w:eastAsia="Times New Roman" w:hAnsi="Times New Roman"/>
-          <w:color w:val="auto"/>
           <w:sz w:val="26"/>
         </w:rPr>
         <w:t>2.6.2. Chi tiết các bảng dữ liệu</w:t>
       </w:r>
-      <w:bookmarkEnd w:id="45"/>
+      <w:bookmarkEnd w:id="58"/>
     </w:p>
     <w:p>
       <w:pPr>
         <w:spacing w:after="120" w:line="312" w:lineRule="auto"/>
         <w:jc w:val="center"/>
       </w:pPr>
+      <w:bookmarkStart w:id="59" w:name="dm_bang_10"/>
       <w:r>
         <w:rPr>
           <w:i/>
         </w:rPr>
         <w:t>Bảng 2.8. Mô tả các bảng dữ liệu chính</w:t>
       </w:r>
+      <w:bookmarkEnd w:id="59"/>
     </w:p>
     <w:tbl>
       <w:tblPr>
@@ -11409,15 +12046,14 @@
           <w:color w:val="auto"/>
         </w:rPr>
       </w:pPr>
-      <w:bookmarkStart w:id="46" w:name="_Toc230635761"/>
+      <w:bookmarkStart w:id="60" w:name="_Toc230639706"/>
       <w:r>
         <w:rPr>
           <w:rFonts w:ascii="Times New Roman" w:eastAsia="Times New Roman" w:hAnsi="Times New Roman"/>
-          <w:color w:val="auto"/>
         </w:rPr>
         <w:t>2.7. Thiết kế giao diện</w:t>
       </w:r>
-      <w:bookmarkEnd w:id="46"/>
+      <w:bookmarkEnd w:id="60"/>
     </w:p>
     <w:p>
       <w:pPr>
@@ -11434,12 +12070,14 @@
         <w:spacing w:after="120" w:line="312" w:lineRule="auto"/>
         <w:jc w:val="center"/>
       </w:pPr>
+      <w:bookmarkStart w:id="61" w:name="dm_bang_11"/>
       <w:r>
         <w:rPr>
           <w:i/>
         </w:rPr>
         <w:t>Bảng 2.9. Danh sách màn hình giao diện dự kiến</w:t>
       </w:r>
+      <w:bookmarkEnd w:id="61"/>
     </w:p>
     <w:tbl>
       <w:tblPr>
@@ -12006,7 +12644,7 @@
         <w:pStyle w:val="Heading3"/>
         <w:spacing w:after="120" w:line="312" w:lineRule="auto"/>
       </w:pPr>
-      <w:bookmarkStart w:id="47" w:name="_Toc230635762"/>
+      <w:bookmarkStart w:id="62" w:name="_Toc230639707"/>
       <w:r>
         <w:rPr>
           <w:rFonts w:ascii="Times New Roman" w:eastAsia="Times New Roman" w:hAnsi="Times New Roman"/>
@@ -12015,7 +12653,7 @@
         <w:lastRenderedPageBreak/>
         <w:t>2.7.1. Phác thảo các màn hình giao diện</w:t>
       </w:r>
-      <w:bookmarkEnd w:id="47"/>
+      <w:bookmarkEnd w:id="62"/>
     </w:p>
     <w:p>
       <w:pPr>
@@ -12036,7 +12674,7 @@
           <w:noProof/>
         </w:rPr>
         <w:drawing>
-          <wp:inline distT="0" distB="0" distL="0" distR="0" wp14:anchorId="0F7E6145" wp14:editId="7E665DDE">
+          <wp:inline distT="0" distB="0" distL="0" distR="0" wp14:anchorId="13EACB7A" wp14:editId="318CC7E9">
             <wp:extent cx="5580000" cy="3313125"/>
             <wp:effectExtent l="0" t="0" r="0" b="0"/>
             <wp:docPr id="6" name="Picture 6"/>
@@ -12077,12 +12715,14 @@
         <w:spacing w:after="120" w:line="312" w:lineRule="auto"/>
         <w:jc w:val="center"/>
       </w:pPr>
+      <w:bookmarkStart w:id="63" w:name="dm_hinh_5"/>
       <w:r>
         <w:rPr>
           <w:i/>
         </w:rPr>
         <w:t>Hình 2.5. Phác thảo màn hình trang chủ</w:t>
       </w:r>
+      <w:bookmarkEnd w:id="63"/>
     </w:p>
     <w:p>
       <w:pPr>
@@ -12093,7 +12733,7 @@
           <w:noProof/>
         </w:rPr>
         <w:drawing>
-          <wp:inline distT="0" distB="0" distL="0" distR="0" wp14:anchorId="382C0AA1" wp14:editId="0CA09B6E">
+          <wp:inline distT="0" distB="0" distL="0" distR="0" wp14:anchorId="00DDFF27" wp14:editId="5F9235E9">
             <wp:extent cx="5580000" cy="3313125"/>
             <wp:effectExtent l="0" t="0" r="0" b="0"/>
             <wp:docPr id="7" name="Picture 7"/>
@@ -12134,12 +12774,14 @@
         <w:spacing w:after="120" w:line="312" w:lineRule="auto"/>
         <w:jc w:val="center"/>
       </w:pPr>
+      <w:bookmarkStart w:id="64" w:name="dm_hinh_6"/>
       <w:r>
         <w:rPr>
           <w:i/>
         </w:rPr>
         <w:t>Hình 2.6. Phác thảo màn hình danh sách sản phẩm</w:t>
       </w:r>
+      <w:bookmarkEnd w:id="64"/>
     </w:p>
     <w:p>
       <w:pPr>
@@ -12151,7 +12793,7 @@
         </w:rPr>
         <w:lastRenderedPageBreak/>
         <w:drawing>
-          <wp:inline distT="0" distB="0" distL="0" distR="0" wp14:anchorId="087795BE" wp14:editId="6EB85823">
+          <wp:inline distT="0" distB="0" distL="0" distR="0" wp14:anchorId="072B1513" wp14:editId="1AD42849">
             <wp:extent cx="5580000" cy="3313125"/>
             <wp:effectExtent l="0" t="0" r="0" b="0"/>
             <wp:docPr id="8" name="Picture 8"/>
@@ -12192,12 +12834,14 @@
         <w:spacing w:after="120" w:line="312" w:lineRule="auto"/>
         <w:jc w:val="center"/>
       </w:pPr>
+      <w:bookmarkStart w:id="65" w:name="dm_hinh_7"/>
       <w:r>
         <w:rPr>
           <w:i/>
         </w:rPr>
         <w:t>Hình 2.7. Phác thảo màn hình chi tiết sản phẩm</w:t>
       </w:r>
+      <w:bookmarkEnd w:id="65"/>
     </w:p>
     <w:p>
       <w:pPr>
@@ -12208,7 +12852,7 @@
           <w:noProof/>
         </w:rPr>
         <w:drawing>
-          <wp:inline distT="0" distB="0" distL="0" distR="0" wp14:anchorId="311A26CF" wp14:editId="534FA2D9">
+          <wp:inline distT="0" distB="0" distL="0" distR="0" wp14:anchorId="581A3CB4" wp14:editId="0197AA79">
             <wp:extent cx="5580000" cy="3313125"/>
             <wp:effectExtent l="0" t="0" r="0" b="0"/>
             <wp:docPr id="9" name="Picture 9"/>
@@ -12249,12 +12893,14 @@
         <w:spacing w:after="120" w:line="312" w:lineRule="auto"/>
         <w:jc w:val="center"/>
       </w:pPr>
+      <w:bookmarkStart w:id="66" w:name="dm_hinh_8"/>
       <w:r>
         <w:rPr>
           <w:i/>
         </w:rPr>
         <w:t>Hình 2.8. Phác thảo màn hình giỏ hàng và checkout</w:t>
       </w:r>
+      <w:bookmarkEnd w:id="66"/>
     </w:p>
     <w:p>
       <w:pPr>
@@ -12266,7 +12912,7 @@
         </w:rPr>
         <w:lastRenderedPageBreak/>
         <w:drawing>
-          <wp:inline distT="0" distB="0" distL="0" distR="0" wp14:anchorId="31273BE5" wp14:editId="49318A98">
+          <wp:inline distT="0" distB="0" distL="0" distR="0" wp14:anchorId="327398B5" wp14:editId="17B62CCD">
             <wp:extent cx="5580000" cy="3313125"/>
             <wp:effectExtent l="0" t="0" r="0" b="0"/>
             <wp:docPr id="10" name="Picture 10"/>
@@ -12307,12 +12953,14 @@
         <w:spacing w:after="120" w:line="312" w:lineRule="auto"/>
         <w:jc w:val="center"/>
       </w:pPr>
+      <w:bookmarkStart w:id="67" w:name="dm_hinh_9"/>
       <w:r>
         <w:rPr>
           <w:i/>
         </w:rPr>
         <w:t>Hình 2.9. Phác thảo màn hình trợ lý AI GTech</w:t>
       </w:r>
+      <w:bookmarkEnd w:id="67"/>
     </w:p>
     <w:p>
       <w:pPr>
@@ -12323,7 +12971,7 @@
           <w:noProof/>
         </w:rPr>
         <w:drawing>
-          <wp:inline distT="0" distB="0" distL="0" distR="0" wp14:anchorId="0C9ED139" wp14:editId="43CD2FAE">
+          <wp:inline distT="0" distB="0" distL="0" distR="0" wp14:anchorId="42E179AB" wp14:editId="5F05785D">
             <wp:extent cx="5580000" cy="3313125"/>
             <wp:effectExtent l="0" t="0" r="0" b="0"/>
             <wp:docPr id="11" name="Picture 11"/>
@@ -12364,12 +13012,14 @@
         <w:spacing w:after="120" w:line="312" w:lineRule="auto"/>
         <w:jc w:val="center"/>
       </w:pPr>
+      <w:bookmarkStart w:id="68" w:name="dm_hinh_10"/>
       <w:r>
         <w:rPr>
           <w:i/>
         </w:rPr>
         <w:t>Hình 2.10. Phác thảo màn hình admin tổng quan</w:t>
       </w:r>
+      <w:bookmarkEnd w:id="68"/>
     </w:p>
     <w:p>
       <w:pPr>
@@ -12381,7 +13031,7 @@
         </w:rPr>
         <w:lastRenderedPageBreak/>
         <w:drawing>
-          <wp:inline distT="0" distB="0" distL="0" distR="0" wp14:anchorId="31AAF3FD" wp14:editId="065EF938">
+          <wp:inline distT="0" distB="0" distL="0" distR="0" wp14:anchorId="6FE764D8" wp14:editId="1B14A33D">
             <wp:extent cx="5580000" cy="3313125"/>
             <wp:effectExtent l="0" t="0" r="0" b="0"/>
             <wp:docPr id="12" name="Picture 12"/>
@@ -12422,12 +13072,14 @@
         <w:spacing w:after="120" w:line="312" w:lineRule="auto"/>
         <w:jc w:val="center"/>
       </w:pPr>
+      <w:bookmarkStart w:id="69" w:name="dm_hinh_11"/>
       <w:r>
         <w:rPr>
           <w:i/>
         </w:rPr>
         <w:t>Hình 2.11. Phác thảo màn hình admin quản lý sản phẩm</w:t>
       </w:r>
+      <w:bookmarkEnd w:id="69"/>
     </w:p>
     <w:p>
       <w:pPr>
@@ -12438,7 +13090,7 @@
           <w:noProof/>
         </w:rPr>
         <w:drawing>
-          <wp:inline distT="0" distB="0" distL="0" distR="0" wp14:anchorId="048B97B0" wp14:editId="7A46F335">
+          <wp:inline distT="0" distB="0" distL="0" distR="0" wp14:anchorId="01C71CE0" wp14:editId="4EAB7C50">
             <wp:extent cx="5580000" cy="3313125"/>
             <wp:effectExtent l="0" t="0" r="0" b="0"/>
             <wp:docPr id="13" name="Picture 13"/>
@@ -12479,12 +13131,14 @@
         <w:spacing w:after="120" w:line="312" w:lineRule="auto"/>
         <w:jc w:val="center"/>
       </w:pPr>
+      <w:bookmarkStart w:id="70" w:name="dm_hinh_12"/>
       <w:r>
         <w:rPr>
           <w:i/>
         </w:rPr>
         <w:t>Hình 2.12. Phác thảo màn hình admin quản lý đơn hàng</w:t>
       </w:r>
+      <w:bookmarkEnd w:id="70"/>
     </w:p>
     <w:p>
       <w:pPr>
@@ -12492,28 +13146,28 @@
         <w:spacing w:before="60" w:after="120" w:line="312" w:lineRule="auto"/>
         <w:jc w:val="center"/>
       </w:pPr>
-      <w:bookmarkStart w:id="48" w:name="_Toc230635763"/>
+      <w:bookmarkStart w:id="71" w:name="_Toc230639708"/>
       <w:r>
         <w:rPr>
           <w:rFonts w:ascii="Times New Roman" w:eastAsia="Times New Roman" w:hAnsi="Times New Roman"/>
         </w:rPr>
         <w:t>CHƯƠNG 3: CÀI ĐẶT VÀ TRIỂN KHAI HỆ THỐNG</w:t>
       </w:r>
-      <w:bookmarkEnd w:id="48"/>
+      <w:bookmarkEnd w:id="71"/>
     </w:p>
     <w:p>
       <w:pPr>
         <w:pStyle w:val="Heading2"/>
         <w:spacing w:before="60" w:after="120" w:line="312" w:lineRule="auto"/>
       </w:pPr>
-      <w:bookmarkStart w:id="49" w:name="_Toc230635764"/>
+      <w:bookmarkStart w:id="72" w:name="_Toc230639709"/>
       <w:r>
         <w:rPr>
           <w:rFonts w:ascii="Times New Roman" w:eastAsia="Times New Roman" w:hAnsi="Times New Roman"/>
         </w:rPr>
         <w:t>3.1. Giới thiệu về công cụ và môi trường cài đặt</w:t>
       </w:r>
-      <w:bookmarkEnd w:id="49"/>
+      <w:bookmarkEnd w:id="72"/>
     </w:p>
     <w:p>
       <w:pPr>
@@ -12534,12 +13188,14 @@
         <w:spacing w:after="120" w:line="312" w:lineRule="auto"/>
         <w:jc w:val="center"/>
       </w:pPr>
+      <w:bookmarkStart w:id="73" w:name="dm_bang_12"/>
       <w:r>
         <w:rPr>
           <w:i/>
         </w:rPr>
         <w:t>Bảng 3.1. Công cụ và môi trường cài đặt</w:t>
       </w:r>
+      <w:bookmarkEnd w:id="73"/>
     </w:p>
     <w:tbl>
       <w:tblPr>
@@ -12991,7 +13647,7 @@
           <w:noProof/>
         </w:rPr>
         <w:drawing>
-          <wp:inline distT="0" distB="0" distL="0" distR="0" wp14:anchorId="0EED21E8" wp14:editId="3A3A7941">
+          <wp:inline distT="0" distB="0" distL="0" distR="0" wp14:anchorId="23CCF916" wp14:editId="097C7A51">
             <wp:extent cx="5580000" cy="3162000"/>
             <wp:effectExtent l="0" t="0" r="0" b="0"/>
             <wp:docPr id="5" name="Picture 5"/>
@@ -13032,19 +13688,21 @@
         <w:spacing w:after="120" w:line="312" w:lineRule="auto"/>
         <w:jc w:val="center"/>
       </w:pPr>
+      <w:bookmarkStart w:id="74" w:name="dm_hinh_13"/>
       <w:r>
         <w:rPr>
           <w:i/>
         </w:rPr>
         <w:t>Hình 3.1. Kiến trúc triển khai dự kiến của hệ thống</w:t>
       </w:r>
+      <w:bookmarkEnd w:id="74"/>
     </w:p>
     <w:p>
       <w:pPr>
         <w:pStyle w:val="Heading2"/>
         <w:spacing w:before="60" w:after="120" w:line="312" w:lineRule="auto"/>
       </w:pPr>
-      <w:bookmarkStart w:id="50" w:name="_Toc230635765"/>
+      <w:bookmarkStart w:id="75" w:name="_Toc230639710"/>
       <w:r>
         <w:rPr>
           <w:rFonts w:ascii="Times New Roman" w:eastAsia="Times New Roman" w:hAnsi="Times New Roman"/>
@@ -13052,7 +13710,7 @@
         <w:lastRenderedPageBreak/>
         <w:t>3.2. Trang màn hình giao diện của khách hàng</w:t>
       </w:r>
-      <w:bookmarkEnd w:id="50"/>
+      <w:bookmarkEnd w:id="75"/>
     </w:p>
     <w:p>
       <w:pPr>
@@ -13079,12 +13737,14 @@
         <w:spacing w:after="120" w:line="312" w:lineRule="auto"/>
         <w:jc w:val="center"/>
       </w:pPr>
+      <w:bookmarkStart w:id="76" w:name="dm_bang_13"/>
       <w:r>
         <w:rPr>
           <w:i/>
         </w:rPr>
         <w:t>Bảng 3.2. Chức năng giao diện khách hàng</w:t>
       </w:r>
+      <w:bookmarkEnd w:id="76"/>
     </w:p>
     <w:tbl>
       <w:tblPr>
@@ -13392,14 +14052,14 @@
         <w:pStyle w:val="Heading2"/>
         <w:spacing w:before="60" w:after="120" w:line="312" w:lineRule="auto"/>
       </w:pPr>
-      <w:bookmarkStart w:id="51" w:name="_Toc230635766"/>
+      <w:bookmarkStart w:id="77" w:name="_Toc230639711"/>
       <w:r>
         <w:rPr>
           <w:rFonts w:ascii="Times New Roman" w:eastAsia="Times New Roman" w:hAnsi="Times New Roman"/>
         </w:rPr>
         <w:t>3.3. Trang màn hình giao diện của người quản trị</w:t>
       </w:r>
-      <w:bookmarkEnd w:id="51"/>
+      <w:bookmarkEnd w:id="77"/>
     </w:p>
     <w:p>
       <w:pPr>
@@ -13427,12 +14087,14 @@
         <w:spacing w:after="120" w:line="312" w:lineRule="auto"/>
         <w:jc w:val="center"/>
       </w:pPr>
+      <w:bookmarkStart w:id="78" w:name="dm_bang_14"/>
       <w:r>
         <w:rPr>
           <w:i/>
         </w:rPr>
         <w:t>Bảng 3.3. Chức năng giao diện quản trị</w:t>
       </w:r>
+      <w:bookmarkEnd w:id="78"/>
     </w:p>
     <w:tbl>
       <w:tblPr>
@@ -13740,14 +14402,14 @@
         <w:pStyle w:val="Heading2"/>
         <w:spacing w:before="60" w:after="120" w:line="312" w:lineRule="auto"/>
       </w:pPr>
-      <w:bookmarkStart w:id="52" w:name="_Toc230635767"/>
+      <w:bookmarkStart w:id="79" w:name="_Toc230639712"/>
       <w:r>
         <w:rPr>
           <w:rFonts w:ascii="Times New Roman" w:eastAsia="Times New Roman" w:hAnsi="Times New Roman"/>
         </w:rPr>
         <w:t>3.4. Một số giao diện khác</w:t>
       </w:r>
-      <w:bookmarkEnd w:id="52"/>
+      <w:bookmarkEnd w:id="79"/>
     </w:p>
     <w:p>
       <w:pPr>
@@ -13764,14 +14426,14 @@
         <w:pStyle w:val="Heading2"/>
         <w:spacing w:before="60" w:after="120" w:line="312" w:lineRule="auto"/>
       </w:pPr>
-      <w:bookmarkStart w:id="53" w:name="_Toc230635768"/>
+      <w:bookmarkStart w:id="80" w:name="_Toc230639713"/>
       <w:r>
         <w:rPr>
           <w:rFonts w:ascii="Times New Roman" w:eastAsia="Times New Roman" w:hAnsi="Times New Roman"/>
         </w:rPr>
         <w:t>3.5. Kiểm thử</w:t>
       </w:r>
-      <w:bookmarkEnd w:id="53"/>
+      <w:bookmarkEnd w:id="80"/>
     </w:p>
     <w:p>
       <w:pPr>
@@ -13788,12 +14450,14 @@
         <w:spacing w:after="120" w:line="312" w:lineRule="auto"/>
         <w:jc w:val="center"/>
       </w:pPr>
+      <w:bookmarkStart w:id="81" w:name="dm_bang_15"/>
       <w:r>
         <w:rPr>
           <w:i/>
         </w:rPr>
         <w:t>Bảng 3.4. Kế hoạch kiểm thử chức năng chính</w:t>
       </w:r>
+      <w:bookmarkEnd w:id="81"/>
     </w:p>
     <w:tbl>
       <w:tblPr>
@@ -14237,7 +14901,7 @@
         <w:spacing w:after="120" w:line="312" w:lineRule="auto"/>
         <w:jc w:val="center"/>
       </w:pPr>
-      <w:bookmarkStart w:id="54" w:name="_Toc230635769"/>
+      <w:bookmarkStart w:id="82" w:name="_Toc230639714"/>
       <w:r>
         <w:rPr>
           <w:rFonts w:ascii="Times New Roman" w:eastAsia="Times New Roman" w:hAnsi="Times New Roman"/>
@@ -14245,7 +14909,7 @@
         <w:lastRenderedPageBreak/>
         <w:t>KẾT LUẬN</w:t>
       </w:r>
-      <w:bookmarkEnd w:id="54"/>
+      <w:bookmarkEnd w:id="82"/>
     </w:p>
     <w:p>
       <w:pPr>
@@ -14288,7 +14952,7 @@
         <w:spacing w:after="120" w:line="312" w:lineRule="auto"/>
         <w:jc w:val="center"/>
       </w:pPr>
-      <w:bookmarkStart w:id="55" w:name="_Toc230635770"/>
+      <w:bookmarkStart w:id="83" w:name="_Toc230639715"/>
       <w:r>
         <w:rPr>
           <w:rFonts w:ascii="Times New Roman" w:eastAsia="Times New Roman" w:hAnsi="Times New Roman"/>
@@ -14296,7 +14960,7 @@
         <w:lastRenderedPageBreak/>
         <w:t>TÀI LIỆU THAM KHẢO</w:t>
       </w:r>
-      <w:bookmarkEnd w:id="55"/>
+      <w:bookmarkEnd w:id="83"/>
     </w:p>
     <w:p>
       <w:pPr>
@@ -15068,6 +15732,7 @@
     <w:rsid w:val="00FC693F"/>
     <w:rPr>
       <w:rFonts w:ascii="Times New Roman" w:eastAsia="Times New Roman" w:hAnsi="Times New Roman"/>
+      <w:color w:val="000000"/>
       <w:sz w:val="28"/>
     </w:rPr>
   </w:style>
@@ -15089,7 +15754,6 @@
       <w:rFonts w:asciiTheme="majorHAnsi" w:eastAsiaTheme="majorEastAsia" w:hAnsiTheme="majorHAnsi" w:cstheme="majorBidi"/>
       <w:b/>
       <w:bCs/>
-      <w:color w:val="365F91" w:themeColor="accent1" w:themeShade="BF"/>
       <w:szCs w:val="28"/>
     </w:rPr>
   </w:style>
@@ -15112,7 +15776,6 @@
       <w:rFonts w:asciiTheme="majorHAnsi" w:eastAsiaTheme="majorEastAsia" w:hAnsiTheme="majorHAnsi" w:cstheme="majorBidi"/>
       <w:b/>
       <w:bCs/>
-      <w:color w:val="4F81BD" w:themeColor="accent1"/>
       <w:szCs w:val="26"/>
     </w:rPr>
   </w:style>
@@ -15136,7 +15799,6 @@
       <w:b/>
       <w:bCs/>
       <w:i/>
-      <w:color w:val="4F81BD" w:themeColor="accent1"/>
     </w:rPr>
   </w:style>
   <w:style w:type="paragraph" w:styleId="Heading4">
@@ -15160,7 +15822,6 @@
       <w:bCs/>
       <w:i/>
       <w:iCs/>
-      <w:color w:val="4F81BD" w:themeColor="accent1"/>
     </w:rPr>
   </w:style>
   <w:style w:type="paragraph" w:styleId="Heading5">
@@ -26090,7 +26751,8 @@
     <w:unhideWhenUsed/>
     <w:rsid w:val="00D27B97"/>
     <w:rPr>
-      <w:color w:val="0000FF" w:themeColor="hyperlink"/>
+      <w:rFonts w:ascii="Times New Roman" w:hAnsi="Times New Roman"/>
+      <w:color w:val="000000"/>
       <w:u w:val="single"/>
     </w:rPr>
   </w:style>

</xml_diff>